<commit_message>
fixed header and footer replacement
</commit_message>
<xml_diff>
--- a/.claude/skills/per-option-value/template/ESO_Report Template_v2.docx
+++ b/.claude/skills/per-option-value/template/ESO_Report Template_v2.docx
@@ -1537,22 +1537,11 @@
         <w:spacing w:line="320" w:lineRule="atLeast"/>
         <w:ind w:right="26" w:firstLine="0"/>
         <w:rPr>
-          <w:b/>
-          <w:bCs/>
-          <w:color w:val="262626"/>
-          <w:sz w:val="24"/>
-        </w:rPr>
-      </w:pPr>
-      <w:r>
-        <w:rPr>
-          <w:b/>
-          <w:bCs/>
           <w:color w:val="262626"/>
           <w:sz w:val="28"/>
           <w:szCs w:val="28"/>
         </w:rPr>
-        <w:t>t</w:t>
-      </w:r>
+      </w:pPr>
       <w:r>
         <w:rPr>
           <w:b/>
@@ -1561,7 +1550,7 @@
           <w:sz w:val="28"/>
           <w:szCs w:val="28"/>
         </w:rPr>
-        <w:t xml:space="preserve">he </w:t>
+        <w:t>t</w:t>
       </w:r>
       <w:r>
         <w:rPr>
@@ -1571,22 +1560,51 @@
           <w:sz w:val="28"/>
           <w:szCs w:val="28"/>
         </w:rPr>
-        <w:t>Valuation of Share Options Granted by [Client Company Name]</w:t>
-      </w:r>
-    </w:p>
-    <w:p>
-      <w:pPr>
-        <w:pStyle w:val="Title"/>
-        <w:spacing w:line="320" w:lineRule="atLeast"/>
-        <w:ind w:right="26" w:firstLine="0"/>
-        <w:jc w:val="left"/>
-        <w:rPr>
+        <w:t xml:space="preserve">he </w:t>
+      </w:r>
+      <w:r>
+        <w:rPr>
+          <w:b/>
+          <w:bCs/>
           <w:color w:val="262626"/>
           <w:sz w:val="28"/>
           <w:szCs w:val="28"/>
-          <w:lang w:val="en-GB"/>
-        </w:rPr>
-      </w:pPr>
+        </w:rPr>
+        <w:t xml:space="preserve">Valuation of Share Options Granted by </w:t>
+      </w:r>
+      <w:r>
+        <w:rPr>
+          <w:b/>
+          <w:bCs/>
+          <w:color w:val="262626"/>
+          <w:sz w:val="28"/>
+          <w:szCs w:val="28"/>
+        </w:rPr>
+        <w:t>{{</w:t>
+      </w:r>
+      <w:proofErr w:type="spellStart"/>
+      <w:r>
+        <w:rPr>
+          <w:b/>
+          <w:bCs/>
+          <w:color w:val="262626"/>
+          <w:sz w:val="28"/>
+          <w:szCs w:val="28"/>
+          <w:lang w:val="en-US"/>
+        </w:rPr>
+        <w:t>ClientCompanyName</w:t>
+      </w:r>
+      <w:proofErr w:type="spellEnd"/>
+      <w:r>
+        <w:rPr>
+          <w:b/>
+          <w:bCs/>
+          <w:color w:val="262626"/>
+          <w:sz w:val="24"/>
+          <w:lang w:val="en-US"/>
+        </w:rPr>
+        <w:t>}}</w:t>
+      </w:r>
     </w:p>
     <w:p>
       <w:pPr>
@@ -7570,6 +7588,7 @@
               <w:t>CurrencyUnit</w:t>
             </w:r>
             <w:proofErr w:type="spellEnd"/>
+            <w:proofErr w:type="gramStart"/>
             <w:r>
               <w:rPr>
                 <w:bCs/>
@@ -7578,7 +7597,18 @@
                 <w:szCs w:val="20"/>
                 <w:highlight w:val="green"/>
               </w:rPr>
-              <w:t>}}{{</w:t>
+              <w:t>}}{</w:t>
+            </w:r>
+            <w:proofErr w:type="gramEnd"/>
+            <w:r>
+              <w:rPr>
+                <w:bCs/>
+                <w:kern w:val="0"/>
+                <w:sz w:val="20"/>
+                <w:szCs w:val="20"/>
+                <w:highlight w:val="green"/>
+              </w:rPr>
+              <w:t>{</w:t>
             </w:r>
             <w:proofErr w:type="spellStart"/>
             <w:r>
@@ -7777,6 +7807,7 @@
               <w:t>CurrencyUnit</w:t>
             </w:r>
             <w:proofErr w:type="spellEnd"/>
+            <w:proofErr w:type="gramStart"/>
             <w:r>
               <w:rPr>
                 <w:bCs/>
@@ -7785,7 +7816,18 @@
                 <w:szCs w:val="20"/>
                 <w:highlight w:val="green"/>
               </w:rPr>
-              <w:t>}}{{</w:t>
+              <w:t>}}{</w:t>
+            </w:r>
+            <w:proofErr w:type="gramEnd"/>
+            <w:r>
+              <w:rPr>
+                <w:bCs/>
+                <w:kern w:val="0"/>
+                <w:sz w:val="20"/>
+                <w:szCs w:val="20"/>
+                <w:highlight w:val="green"/>
+              </w:rPr>
+              <w:t>{</w:t>
             </w:r>
             <w:proofErr w:type="spellStart"/>
             <w:r>
@@ -12524,14 +12566,12 @@
         <w:ind w:rightChars="0" w:right="-15" w:firstLine="0"/>
         <w:rPr>
           <w:b/>
-          <w:highlight w:val="yellow"/>
           <w:lang w:eastAsia="zh-HK"/>
         </w:rPr>
       </w:pPr>
       <w:r>
         <w:rPr>
           <w:b/>
-          <w:highlight w:val="yellow"/>
           <w:lang w:eastAsia="zh-HK"/>
         </w:rPr>
         <w:t>[Henry H.W. Yung</w:t>
@@ -12544,14 +12584,12 @@
         <w:ind w:rightChars="0" w:right="-15" w:firstLine="0"/>
         <w:rPr>
           <w:bCs/>
-          <w:highlight w:val="yellow"/>
           <w:lang w:eastAsia="zh-HK"/>
         </w:rPr>
       </w:pPr>
       <w:r>
         <w:rPr>
           <w:bCs/>
-          <w:highlight w:val="yellow"/>
           <w:lang w:eastAsia="zh-HK"/>
         </w:rPr>
         <w:t>Manager</w:t>
@@ -12568,9 +12606,6 @@
         <w:snapToGrid w:val="0"/>
         <w:spacing w:line="320" w:lineRule="exact"/>
         <w:ind w:right="26"/>
-        <w:rPr>
-          <w:highlight w:val="yellow"/>
-        </w:rPr>
       </w:pPr>
     </w:p>
     <w:p>
@@ -12585,56 +12620,35 @@
         <w:spacing w:line="320" w:lineRule="exact"/>
         <w:ind w:right="26"/>
         <w:rPr>
-          <w:highlight w:val="yellow"/>
           <w:lang w:eastAsia="zh-HK"/>
         </w:rPr>
       </w:pPr>
       <w:r>
-        <w:rPr>
-          <w:highlight w:val="yellow"/>
-        </w:rPr>
         <w:t xml:space="preserve">Mr. Henry H.W. Yung has over </w:t>
       </w:r>
       <w:r>
-        <w:rPr>
-          <w:highlight w:val="yellow"/>
-        </w:rPr>
         <w:t>5</w:t>
       </w:r>
       <w:r>
-        <w:rPr>
-          <w:highlight w:val="yellow"/>
-        </w:rPr>
         <w:t xml:space="preserve"> years of work experience in business valuation and financial </w:t>
       </w:r>
       <w:r>
         <w:rPr>
-          <w:highlight w:val="yellow"/>
           <w:lang w:eastAsia="zh-HK"/>
         </w:rPr>
         <w:t>advisory</w:t>
       </w:r>
       <w:r>
-        <w:rPr>
-          <w:highlight w:val="yellow"/>
-        </w:rPr>
         <w:t xml:space="preserve"> services. He has been involved in more than a hundred projects in connection with initial public offering, merger and acquisition or financial reporting. He obtained his Bachelor Degrees in Accounting and Financ</w:t>
       </w:r>
       <w:r>
-        <w:rPr>
-          <w:highlight w:val="yellow"/>
-        </w:rPr>
         <w:t>e</w:t>
       </w:r>
       <w:r>
-        <w:rPr>
-          <w:highlight w:val="yellow"/>
-        </w:rPr>
         <w:t xml:space="preserve"> at the University of Warwick.</w:t>
       </w:r>
       <w:r>
         <w:rPr>
-          <w:highlight w:val="yellow"/>
           <w:lang w:eastAsia="zh-HK"/>
         </w:rPr>
         <w:t>]</w:t>
@@ -12652,7 +12666,6 @@
         <w:spacing w:line="320" w:lineRule="exact"/>
         <w:ind w:right="26"/>
         <w:rPr>
-          <w:highlight w:val="yellow"/>
           <w:lang w:eastAsia="zh-HK"/>
         </w:rPr>
       </w:pPr>
@@ -12664,14 +12677,12 @@
         <w:ind w:rightChars="0" w:right="-15" w:firstLine="0"/>
         <w:rPr>
           <w:bCs/>
-          <w:highlight w:val="yellow"/>
           <w:lang w:eastAsia="zh-HK"/>
         </w:rPr>
       </w:pPr>
       <w:r>
         <w:rPr>
           <w:b/>
-          <w:highlight w:val="yellow"/>
           <w:lang w:eastAsia="zh-HK"/>
         </w:rPr>
         <w:t>[</w:t>
@@ -12679,7 +12690,6 @@
       <w:r>
         <w:rPr>
           <w:b/>
-          <w:highlight w:val="yellow"/>
           <w:lang w:eastAsia="zh-HK"/>
         </w:rPr>
         <w:t>Marvin T.Y. Chan</w:t>
@@ -12687,7 +12697,6 @@
       <w:r>
         <w:rPr>
           <w:bCs/>
-          <w:highlight w:val="yellow"/>
           <w:lang w:eastAsia="zh-HK"/>
         </w:rPr>
         <w:t>,</w:t>
@@ -12697,7 +12706,6 @@
           <w:b/>
           <w:sz w:val="20"/>
           <w:szCs w:val="22"/>
-          <w:highlight w:val="yellow"/>
           <w:lang w:eastAsia="zh-HK"/>
         </w:rPr>
         <w:t xml:space="preserve"> </w:t>
@@ -12707,7 +12715,6 @@
           <w:bCs/>
           <w:sz w:val="20"/>
           <w:szCs w:val="22"/>
-          <w:highlight w:val="yellow"/>
           <w:lang w:eastAsia="zh-HK"/>
         </w:rPr>
         <w:t>CFA</w:t>
@@ -12720,14 +12727,12 @@
         <w:ind w:rightChars="0" w:right="-15" w:firstLine="0"/>
         <w:rPr>
           <w:bCs/>
-          <w:highlight w:val="yellow"/>
           <w:lang w:eastAsia="zh-HK"/>
         </w:rPr>
       </w:pPr>
       <w:r>
         <w:rPr>
           <w:bCs/>
-          <w:highlight w:val="yellow"/>
           <w:lang w:eastAsia="zh-HK"/>
         </w:rPr>
         <w:t>Assistant Manager</w:t>
@@ -12744,9 +12749,6 @@
         <w:snapToGrid w:val="0"/>
         <w:spacing w:line="320" w:lineRule="exact"/>
         <w:ind w:right="26"/>
-        <w:rPr>
-          <w:highlight w:val="yellow"/>
-        </w:rPr>
       </w:pPr>
     </w:p>
     <w:p>
@@ -12760,28 +12762,16 @@
         <w:snapToGrid w:val="0"/>
         <w:spacing w:line="320" w:lineRule="exact"/>
         <w:ind w:right="26"/>
-        <w:rPr>
-          <w:highlight w:val="yellow"/>
-        </w:rPr>
-      </w:pPr>
-      <w:r>
-        <w:rPr>
-          <w:highlight w:val="yellow"/>
-        </w:rPr>
+      </w:pPr>
+      <w:r>
         <w:t xml:space="preserve">Mr. Marvin T.Y. Chan is a CFA </w:t>
       </w:r>
       <w:proofErr w:type="spellStart"/>
       <w:r>
-        <w:rPr>
-          <w:highlight w:val="yellow"/>
-        </w:rPr>
         <w:t>Charterholder</w:t>
       </w:r>
       <w:proofErr w:type="spellEnd"/>
       <w:r>
-        <w:rPr>
-          <w:highlight w:val="yellow"/>
-        </w:rPr>
         <w:t>. He obtained his Bachelors’ Degree in Business Administration majoring in Finance from the University of Washington. He has been working in the financial industry since 2019, with past experience in asset management, investment advisory, and financial market research.]</w:t>
       </w:r>
     </w:p>
@@ -12798,7 +12788,6 @@
         <w:ind w:right="26"/>
         <w:rPr>
           <w:b/>
-          <w:highlight w:val="yellow"/>
           <w:lang w:eastAsia="zh-HK"/>
         </w:rPr>
       </w:pPr>
@@ -12810,14 +12799,12 @@
         <w:ind w:rightChars="0" w:right="-15" w:firstLine="0"/>
         <w:rPr>
           <w:b/>
-          <w:highlight w:val="yellow"/>
           <w:lang w:eastAsia="zh-HK"/>
         </w:rPr>
       </w:pPr>
       <w:r>
         <w:rPr>
           <w:b/>
-          <w:highlight w:val="yellow"/>
           <w:lang w:eastAsia="zh-HK"/>
         </w:rPr>
         <w:t>[Christy Y.C. Szeto</w:t>
@@ -12830,14 +12817,12 @@
         <w:ind w:rightChars="0" w:right="-15" w:firstLine="0"/>
         <w:rPr>
           <w:bCs/>
-          <w:highlight w:val="yellow"/>
           <w:lang w:eastAsia="zh-HK"/>
         </w:rPr>
       </w:pPr>
       <w:r>
         <w:rPr>
           <w:bCs/>
-          <w:highlight w:val="yellow"/>
           <w:lang w:eastAsia="zh-HK"/>
         </w:rPr>
         <w:t xml:space="preserve">Senior </w:t>
@@ -12846,7 +12831,6 @@
         <w:rPr>
           <w:rFonts w:hint="eastAsia"/>
           <w:bCs/>
-          <w:highlight w:val="yellow"/>
           <w:lang w:eastAsia="zh-HK"/>
         </w:rPr>
         <w:t>A</w:t>
@@ -12854,7 +12838,6 @@
       <w:r>
         <w:rPr>
           <w:bCs/>
-          <w:highlight w:val="yellow"/>
           <w:lang w:eastAsia="zh-HK"/>
         </w:rPr>
         <w:t>nalyst</w:t>
@@ -12872,7 +12855,6 @@
         <w:spacing w:line="320" w:lineRule="exact"/>
         <w:ind w:right="26"/>
         <w:rPr>
-          <w:highlight w:val="yellow"/>
           <w:lang w:eastAsia="zh-HK"/>
         </w:rPr>
       </w:pPr>
@@ -12894,7 +12876,6 @@
       </w:pPr>
       <w:r>
         <w:rPr>
-          <w:highlight w:val="yellow"/>
           <w:lang w:eastAsia="zh-HK"/>
         </w:rPr>
         <w:t>Ms. Christy Y.C. Szeto obtained MSc Finance from University College London and Bachelor of Commerce from University of Toronto.]</w:t>
@@ -16758,6 +16739,7 @@
   <w:style w:type="character" w:default="1" w:styleId="DefaultParagraphFont">
     <w:name w:val="Default Paragraph Font"/>
     <w:uiPriority w:val="1"/>
+    <w:semiHidden/>
     <w:unhideWhenUsed/>
   </w:style>
   <w:style w:type="table" w:default="1" w:styleId="TableNormal">

</xml_diff>

<commit_message>
change template to normal bg color
</commit_message>
<xml_diff>
--- a/.claude/skills/per-option-value/template/ESO_Report Template_v2.docx
+++ b/.claude/skills/per-option-value/template/ESO_Report Template_v2.docx
@@ -1933,7 +1933,6 @@
               <w:rPr>
                 <w:b/>
                 <w:color w:val="262626"/>
-                <w:highlight w:val="yellow"/>
               </w:rPr>
               <w:t>{{</w:t>
             </w:r>
@@ -1942,7 +1941,6 @@
               <w:rPr>
                 <w:b/>
                 <w:color w:val="262626"/>
-                <w:highlight w:val="yellow"/>
               </w:rPr>
               <w:t>ReferenceNumber</w:t>
             </w:r>
@@ -1951,7 +1949,6 @@
               <w:rPr>
                 <w:b/>
                 <w:color w:val="262626"/>
-                <w:highlight w:val="yellow"/>
               </w:rPr>
               <w:t>}}</w:t>
             </w:r>
@@ -2089,14 +2086,7 @@
             <w:rStyle w:val="Hyperlink"/>
             <w:noProof/>
           </w:rPr>
-          <w:t>INTENDED USE</w:t>
-        </w:r>
-        <w:r>
-          <w:rPr>
-            <w:rStyle w:val="Hyperlink"/>
-            <w:noProof/>
-          </w:rPr>
-          <w:t xml:space="preserve"> OF VALUATION</w:t>
+          <w:t>INTENDED USE OF VALUATION</w:t>
         </w:r>
         <w:r>
           <w:rPr>
@@ -3454,27 +3444,23 @@
               <w:jc w:val="left"/>
               <w:rPr>
                 <w:rFonts w:ascii="Aptos" w:hAnsi="Aptos" w:cs="Open Sans"/>
-                <w:highlight w:val="yellow"/>
               </w:rPr>
             </w:pPr>
             <w:r>
               <w:rPr>
                 <w:rFonts w:ascii="Aptos" w:hAnsi="Aptos" w:cs="Open Sans"/>
-                <w:highlight w:val="yellow"/>
               </w:rPr>
               <w:t>“</w:t>
             </w:r>
             <w:r>
               <w:rPr>
                 <w:rFonts w:ascii="Aptos" w:hAnsi="Aptos" w:cs="Open Sans"/>
-                <w:highlight w:val="yellow"/>
               </w:rPr>
               <w:t>{{HKAS_IAS}}</w:t>
             </w:r>
             <w:r>
               <w:rPr>
                 <w:rFonts w:ascii="Aptos" w:hAnsi="Aptos" w:cs="Open Sans"/>
-                <w:highlight w:val="yellow"/>
               </w:rPr>
               <w:t>”</w:t>
             </w:r>
@@ -3492,20 +3478,17 @@
               <w:ind w:right="26" w:firstLine="0"/>
               <w:rPr>
                 <w:rFonts w:ascii="Aptos" w:hAnsi="Aptos" w:cs="Open Sans"/>
-                <w:highlight w:val="yellow"/>
               </w:rPr>
             </w:pPr>
             <w:r>
               <w:rPr>
                 <w:rFonts w:ascii="Aptos" w:hAnsi="Aptos" w:cs="Open Sans"/>
-                <w:highlight w:val="yellow"/>
               </w:rPr>
               <w:t>[</w:t>
             </w:r>
             <w:r>
               <w:rPr>
                 <w:rFonts w:ascii="Aptos" w:hAnsi="Aptos" w:cs="Open Sans"/>
-                <w:highlight w:val="red"/>
               </w:rPr>
               <w:t>{{</w:t>
             </w:r>
@@ -3513,7 +3496,6 @@
             <w:r>
               <w:rPr>
                 <w:rFonts w:ascii="Aptos" w:hAnsi="Aptos" w:cs="Open Sans"/>
-                <w:highlight w:val="red"/>
               </w:rPr>
               <w:t>HKAS_IAS_Desc</w:t>
             </w:r>
@@ -3521,14 +3503,12 @@
             <w:r>
               <w:rPr>
                 <w:rFonts w:ascii="Aptos" w:hAnsi="Aptos" w:cs="Open Sans"/>
-                <w:highlight w:val="red"/>
               </w:rPr>
               <w:t>}}</w:t>
             </w:r>
             <w:r>
               <w:rPr>
                 <w:rFonts w:ascii="Aptos" w:hAnsi="Aptos" w:cs="Open Sans"/>
-                <w:highlight w:val="red"/>
               </w:rPr>
               <w:t>]</w:t>
             </w:r>
@@ -3548,20 +3528,17 @@
               <w:jc w:val="left"/>
               <w:rPr>
                 <w:rFonts w:ascii="Aptos" w:hAnsi="Aptos" w:cs="Open Sans"/>
-                <w:highlight w:val="green"/>
               </w:rPr>
             </w:pPr>
             <w:r>
               <w:rPr>
                 <w:rFonts w:ascii="Aptos" w:hAnsi="Aptos" w:cs="Open Sans"/>
-                <w:highlight w:val="green"/>
               </w:rPr>
               <w:t>“</w:t>
             </w:r>
             <w:r>
               <w:rPr>
                 <w:rFonts w:ascii="Aptos" w:hAnsi="Aptos" w:cs="Open Sans"/>
-                <w:highlight w:val="green"/>
               </w:rPr>
               <w:t>{{</w:t>
             </w:r>
@@ -3569,7 +3546,6 @@
             <w:r>
               <w:rPr>
                 <w:rFonts w:ascii="Aptos" w:hAnsi="Aptos" w:cs="Open Sans"/>
-                <w:highlight w:val="green"/>
               </w:rPr>
               <w:t>CurrencyUnit</w:t>
             </w:r>
@@ -3577,14 +3553,12 @@
             <w:r>
               <w:rPr>
                 <w:rFonts w:ascii="Aptos" w:hAnsi="Aptos" w:cs="Open Sans"/>
-                <w:highlight w:val="green"/>
               </w:rPr>
               <w:t>}}</w:t>
             </w:r>
             <w:r>
               <w:rPr>
                 <w:rFonts w:ascii="Aptos" w:hAnsi="Aptos" w:cs="Open Sans"/>
-                <w:highlight w:val="green"/>
               </w:rPr>
               <w:t>”</w:t>
             </w:r>
@@ -3601,14 +3575,12 @@
               <w:ind w:right="26" w:firstLine="0"/>
               <w:rPr>
                 <w:rFonts w:ascii="Aptos" w:hAnsi="Aptos" w:cs="Open Sans"/>
-                <w:highlight w:val="green"/>
                 <w:lang w:eastAsia="zh-TW"/>
               </w:rPr>
             </w:pPr>
             <w:r>
               <w:rPr>
                 <w:rFonts w:ascii="Aptos" w:hAnsi="Aptos" w:cs="Open Sans"/>
-                <w:highlight w:val="green"/>
                 <w:lang w:eastAsia="zh-TW"/>
               </w:rPr>
               <w:t>[</w:t>
@@ -3616,7 +3588,6 @@
             <w:r>
               <w:rPr>
                 <w:rFonts w:ascii="Aptos" w:hAnsi="Aptos" w:cs="Open Sans" w:hint="eastAsia"/>
-                <w:highlight w:val="green"/>
                 <w:lang w:eastAsia="zh-TW"/>
               </w:rPr>
               <w:t>{{</w:t>
@@ -3625,7 +3596,6 @@
             <w:r>
               <w:rPr>
                 <w:rFonts w:ascii="Aptos" w:hAnsi="Aptos" w:cs="Open Sans"/>
-                <w:highlight w:val="green"/>
               </w:rPr>
               <w:t>CurrencyUnitDesc</w:t>
             </w:r>
@@ -3633,7 +3603,6 @@
             <w:r>
               <w:rPr>
                 <w:rFonts w:ascii="Aptos" w:hAnsi="Aptos" w:cs="Open Sans" w:hint="eastAsia"/>
-                <w:highlight w:val="green"/>
                 <w:lang w:eastAsia="zh-TW"/>
               </w:rPr>
               <w:t>}}</w:t>
@@ -3641,7 +3610,6 @@
             <w:r>
               <w:rPr>
                 <w:rFonts w:ascii="Aptos" w:hAnsi="Aptos" w:cs="Open Sans"/>
-                <w:highlight w:val="green"/>
                 <w:lang w:eastAsia="zh-TW"/>
               </w:rPr>
               <w:t>]</w:t>
@@ -3662,27 +3630,23 @@
               <w:jc w:val="left"/>
               <w:rPr>
                 <w:rFonts w:ascii="Aptos" w:hAnsi="Aptos" w:cs="Open Sans"/>
-                <w:highlight w:val="yellow"/>
               </w:rPr>
             </w:pPr>
             <w:r>
               <w:rPr>
                 <w:rFonts w:ascii="Aptos" w:hAnsi="Aptos" w:cs="Open Sans"/>
-                <w:highlight w:val="yellow"/>
               </w:rPr>
               <w:t>“</w:t>
             </w:r>
             <w:r>
               <w:rPr>
                 <w:rFonts w:ascii="Aptos" w:hAnsi="Aptos" w:cs="Open Sans"/>
-                <w:highlight w:val="yellow"/>
               </w:rPr>
               <w:t>{{HKFRS_IFRS}}</w:t>
             </w:r>
             <w:r>
               <w:rPr>
                 <w:rFonts w:ascii="Aptos" w:hAnsi="Aptos" w:cs="Open Sans"/>
-                <w:highlight w:val="yellow"/>
               </w:rPr>
               <w:t>”</w:t>
             </w:r>
@@ -3700,20 +3664,17 @@
               <w:ind w:right="26" w:firstLine="0"/>
               <w:rPr>
                 <w:rFonts w:ascii="Aptos" w:hAnsi="Aptos" w:cs="Open Sans"/>
-                <w:highlight w:val="yellow"/>
               </w:rPr>
             </w:pPr>
             <w:r>
               <w:rPr>
                 <w:rFonts w:ascii="Aptos" w:hAnsi="Aptos" w:cs="Open Sans"/>
-                <w:highlight w:val="yellow"/>
               </w:rPr>
               <w:t>[</w:t>
             </w:r>
             <w:r>
               <w:rPr>
                 <w:rFonts w:ascii="Aptos" w:hAnsi="Aptos" w:cs="Open Sans"/>
-                <w:highlight w:val="red"/>
               </w:rPr>
               <w:t>{{</w:t>
             </w:r>
@@ -3721,7 +3682,6 @@
             <w:r>
               <w:rPr>
                 <w:rFonts w:ascii="Aptos" w:hAnsi="Aptos" w:cs="Open Sans"/>
-                <w:highlight w:val="red"/>
               </w:rPr>
               <w:t>HKFRS_IFRS_Desc</w:t>
             </w:r>
@@ -3729,14 +3689,12 @@
             <w:r>
               <w:rPr>
                 <w:rFonts w:ascii="Aptos" w:hAnsi="Aptos" w:cs="Open Sans"/>
-                <w:highlight w:val="red"/>
               </w:rPr>
               <w:t>}}</w:t>
             </w:r>
             <w:r>
               <w:rPr>
                 <w:rFonts w:ascii="Aptos" w:hAnsi="Aptos" w:cs="Open Sans"/>
-                <w:highlight w:val="red"/>
               </w:rPr>
               <w:t>]</w:t>
             </w:r>
@@ -3847,13 +3805,11 @@
               <w:jc w:val="left"/>
               <w:rPr>
                 <w:rFonts w:ascii="Aptos" w:hAnsi="Aptos" w:cs="Open Sans"/>
-                <w:highlight w:val="green"/>
               </w:rPr>
             </w:pPr>
             <w:r>
               <w:rPr>
                 <w:rFonts w:ascii="Aptos" w:hAnsi="Aptos" w:cs="Open Sans"/>
-                <w:highlight w:val="green"/>
               </w:rPr>
               <w:t>“Options”</w:t>
             </w:r>
@@ -3871,13 +3827,11 @@
               <w:ind w:right="26" w:firstLine="0"/>
               <w:rPr>
                 <w:rFonts w:ascii="Aptos" w:hAnsi="Aptos" w:cs="Open Sans"/>
-                <w:highlight w:val="green"/>
               </w:rPr>
             </w:pPr>
             <w:r>
               <w:rPr>
                 <w:rFonts w:ascii="Aptos" w:hAnsi="Aptos" w:cs="Open Sans"/>
-                <w:highlight w:val="green"/>
               </w:rPr>
               <w:t>[Options granted, to subscribe 23,000,000 ordinary shares, by the Client on 13 May 2022]</w:t>
             </w:r>
@@ -3942,13 +3896,11 @@
               <w:jc w:val="left"/>
               <w:rPr>
                 <w:rFonts w:ascii="Aptos" w:hAnsi="Aptos" w:cs="Open Sans"/>
-                <w:highlight w:val="green"/>
               </w:rPr>
             </w:pPr>
             <w:r>
               <w:rPr>
                 <w:rFonts w:ascii="Aptos" w:hAnsi="Aptos" w:cs="Open Sans"/>
-                <w:highlight w:val="green"/>
               </w:rPr>
               <w:t>“Valuation Date”</w:t>
             </w:r>
@@ -3966,13 +3918,11 @@
               <w:ind w:right="26" w:firstLine="0"/>
               <w:rPr>
                 <w:rFonts w:ascii="Aptos" w:hAnsi="Aptos" w:cs="Open Sans"/>
-                <w:highlight w:val="green"/>
               </w:rPr>
             </w:pPr>
             <w:r>
               <w:rPr>
                 <w:rFonts w:ascii="Aptos" w:hAnsi="Aptos" w:cs="Open Sans"/>
-                <w:highlight w:val="green"/>
               </w:rPr>
               <w:t>{{</w:t>
             </w:r>
@@ -3980,7 +3930,6 @@
             <w:r>
               <w:rPr>
                 <w:rFonts w:ascii="Aptos" w:hAnsi="Aptos" w:cs="Open Sans"/>
-                <w:highlight w:val="green"/>
               </w:rPr>
               <w:t>ValuationDate</w:t>
             </w:r>
@@ -3988,14 +3937,12 @@
             <w:r>
               <w:rPr>
                 <w:rFonts w:ascii="Aptos" w:hAnsi="Aptos" w:cs="Open Sans"/>
-                <w:highlight w:val="green"/>
               </w:rPr>
               <w:t>}}</w:t>
             </w:r>
             <w:r>
               <w:rPr>
                 <w:rFonts w:ascii="Aptos" w:hAnsi="Aptos" w:cs="Open Sans"/>
-                <w:highlight w:val="green"/>
               </w:rPr>
               <w:t>, being the date that this valuation applies</w:t>
             </w:r>
@@ -4131,13 +4078,11 @@
         <w:ind w:right="26" w:firstLine="0"/>
         <w:rPr>
           <w:kern w:val="0"/>
-          <w:highlight w:val="yellow"/>
-        </w:rPr>
-      </w:pPr>
-      <w:r>
-        <w:rPr>
-          <w:kern w:val="0"/>
-          <w:highlight w:val="yellow"/>
+        </w:rPr>
+      </w:pPr>
+      <w:r>
+        <w:rPr>
+          <w:kern w:val="0"/>
         </w:rPr>
         <w:t>{{</w:t>
       </w:r>
@@ -4145,7 +4090,6 @@
       <w:r>
         <w:rPr>
           <w:kern w:val="0"/>
-          <w:highlight w:val="yellow"/>
         </w:rPr>
         <w:t>ClientName</w:t>
       </w:r>
@@ -4153,7 +4097,6 @@
       <w:r>
         <w:rPr>
           <w:kern w:val="0"/>
-          <w:highlight w:val="yellow"/>
         </w:rPr>
         <w:t>}}</w:t>
       </w:r>
@@ -4173,7 +4116,6 @@
       <w:r>
         <w:rPr>
           <w:kern w:val="0"/>
-          <w:highlight w:val="yellow"/>
         </w:rPr>
         <w:t>{{</w:t>
       </w:r>
@@ -4181,7 +4123,6 @@
       <w:r>
         <w:rPr>
           <w:kern w:val="0"/>
-          <w:highlight w:val="yellow"/>
         </w:rPr>
         <w:t>ClientAddress</w:t>
       </w:r>
@@ -4189,7 +4130,6 @@
       <w:r>
         <w:rPr>
           <w:kern w:val="0"/>
-          <w:highlight w:val="yellow"/>
         </w:rPr>
         <w:t>}}</w:t>
       </w:r>
@@ -4399,14 +4339,7 @@
           <w:bCs/>
           <w:kern w:val="0"/>
         </w:rPr>
-        <w:t>Fair Value of the Options granted by the Clien</w:t>
-      </w:r>
-      <w:r>
-        <w:rPr>
-          <w:bCs/>
-          <w:kern w:val="0"/>
-        </w:rPr>
-        <w:t>t</w:t>
+        <w:t>Fair Value of the Options granted by the Client</w:t>
       </w:r>
       <w:r>
         <w:rPr>
@@ -4587,14 +4520,7 @@
           <w:bCs/>
           <w:kern w:val="0"/>
         </w:rPr>
-        <w:t>background of the Options</w:t>
-      </w:r>
-      <w:r>
-        <w:rPr>
-          <w:bCs/>
-          <w:kern w:val="0"/>
-        </w:rPr>
-        <w:t xml:space="preserve">, </w:t>
+        <w:t xml:space="preserve">background of the Options, </w:t>
       </w:r>
       <w:r>
         <w:rPr>
@@ -4849,14 +4775,7 @@
           <w:bCs/>
           <w:kern w:val="0"/>
         </w:rPr>
-        <w:t>We must state that this report and exercise is for the use only by the party to whom it is addressed to and</w:t>
-      </w:r>
-      <w:r>
-        <w:rPr>
-          <w:bCs/>
-          <w:kern w:val="0"/>
-        </w:rPr>
-        <w:t xml:space="preserve"> no responsibility is accepted with respect to any third party for the whole or any part of its contents.</w:t>
+        <w:t>We must state that this report and exercise is for the use only by the party to whom it is addressed to and no responsibility is accepted with respect to any third party for the whole or any part of its contents.</w:t>
       </w:r>
       <w:r>
         <w:rPr>
@@ -4967,77 +4886,7 @@
           <w:bCs/>
           <w:kern w:val="0"/>
         </w:rPr>
-        <w:t xml:space="preserve">Our valuation has been prepared in accordance with </w:t>
-      </w:r>
-      <w:r>
-        <w:rPr>
-          <w:bCs/>
-          <w:kern w:val="0"/>
-        </w:rPr>
-        <w:t xml:space="preserve">the </w:t>
-      </w:r>
-      <w:r>
-        <w:rPr>
-          <w:bCs/>
-          <w:kern w:val="0"/>
-        </w:rPr>
-        <w:t xml:space="preserve">IVS </w:t>
-      </w:r>
-      <w:r>
-        <w:rPr>
-          <w:bCs/>
-          <w:kern w:val="0"/>
-        </w:rPr>
-        <w:t xml:space="preserve">published by the </w:t>
-      </w:r>
-      <w:r>
-        <w:rPr>
-          <w:bCs/>
-          <w:kern w:val="0"/>
-        </w:rPr>
-        <w:t>International Valuation Standards Council</w:t>
-      </w:r>
-      <w:r>
-        <w:rPr>
-          <w:bCs/>
-          <w:kern w:val="0"/>
-        </w:rPr>
-        <w:t xml:space="preserve">, which states that valuations undertaken for inclusion in financial statements </w:t>
-      </w:r>
-      <w:r>
-        <w:rPr>
-          <w:bCs/>
-          <w:kern w:val="0"/>
-        </w:rPr>
-        <w:t>s</w:t>
-      </w:r>
-      <w:r>
-        <w:rPr>
-          <w:bCs/>
-          <w:kern w:val="0"/>
-        </w:rPr>
-        <w:t>hall be provided to meet the requirement of the financial reporting stand</w:t>
-      </w:r>
-      <w:r>
-        <w:rPr>
-          <w:bCs/>
-          <w:kern w:val="0"/>
-        </w:rPr>
-        <w:t>ards</w:t>
-      </w:r>
-      <w:r>
-        <w:rPr>
-          <w:bCs/>
-          <w:kern w:val="0"/>
-        </w:rPr>
-        <w:t xml:space="preserve"> that are applicable, including </w:t>
-      </w:r>
-      <w:r>
-        <w:rPr>
-          <w:bCs/>
-          <w:kern w:val="0"/>
-        </w:rPr>
-        <w:t xml:space="preserve">the </w:t>
+        <w:t xml:space="preserve">Our valuation has been prepared in accordance with the IVS published by the International Valuation Standards Council, which states that valuations undertaken for inclusion in financial statements shall be provided to meet the requirement of the financial reporting standards that are applicable, including the </w:t>
       </w:r>
       <w:r>
         <w:rPr>
@@ -5064,21 +4913,7 @@
           <w:bCs/>
           <w:kern w:val="0"/>
         </w:rPr>
-        <w:t xml:space="preserve"> </w:t>
-      </w:r>
-      <w:r>
-        <w:rPr>
-          <w:bCs/>
-          <w:kern w:val="0"/>
-        </w:rPr>
-        <w:t xml:space="preserve">and </w:t>
-      </w:r>
-      <w:r>
-        <w:rPr>
-          <w:bCs/>
-          <w:kern w:val="0"/>
-        </w:rPr>
-        <w:t xml:space="preserve">the </w:t>
+        <w:t xml:space="preserve"> and the </w:t>
       </w:r>
       <w:r>
         <w:rPr>
@@ -5274,7 +5109,6 @@
         <w:rPr>
           <w:bCs/>
           <w:kern w:val="0"/>
-          <w:highlight w:val="yellow"/>
         </w:rPr>
         <w:t>[</w:t>
       </w:r>
@@ -5282,7 +5116,6 @@
         <w:rPr>
           <w:bCs/>
           <w:kern w:val="0"/>
-          <w:highlight w:val="yellow"/>
         </w:rPr>
         <w:t xml:space="preserve">The Client </w:t>
       </w:r>
@@ -5290,7 +5123,6 @@
         <w:rPr>
           <w:bCs/>
           <w:kern w:val="0"/>
-          <w:highlight w:val="yellow"/>
         </w:rPr>
         <w:t>is a London-based conglomerate established in 1990, operates across diverse sectors such as energy, finance, real estate, and technology. With a global presence spanning Europe, North America, Asia, and Africa, the company caters to a broad customer base with offerings in renewable energy, financial services, property development, and tech solutions.</w:t>
       </w:r>
@@ -5298,7 +5130,6 @@
         <w:rPr>
           <w:bCs/>
           <w:kern w:val="0"/>
-          <w:highlight w:val="yellow"/>
         </w:rPr>
         <w:t>]</w:t>
       </w:r>
@@ -5569,105 +5400,7 @@
           <w:bCs/>
           <w:kern w:val="0"/>
         </w:rPr>
-        <w:t>[</w:t>
-      </w:r>
-      <w:r>
-        <w:rPr>
-          <w:bCs/>
-          <w:kern w:val="0"/>
-        </w:rPr>
-        <w:t xml:space="preserve">Pursuant to the announcement dated </w:t>
-      </w:r>
-      <w:r>
-        <w:rPr>
-          <w:bCs/>
-          <w:kern w:val="0"/>
-        </w:rPr>
-        <w:t xml:space="preserve">13 May 2022 </w:t>
-      </w:r>
-      <w:r>
-        <w:rPr>
-          <w:bCs/>
-          <w:kern w:val="0"/>
-        </w:rPr>
-        <w:t xml:space="preserve">made by the </w:t>
-      </w:r>
-      <w:r>
-        <w:rPr>
-          <w:bCs/>
-          <w:kern w:val="0"/>
-        </w:rPr>
-        <w:t>Client</w:t>
-      </w:r>
-      <w:r>
-        <w:rPr>
-          <w:bCs/>
-          <w:kern w:val="0"/>
-        </w:rPr>
-        <w:t xml:space="preserve">, </w:t>
-      </w:r>
-      <w:r>
-        <w:rPr>
-          <w:bCs/>
-          <w:kern w:val="0"/>
-        </w:rPr>
-        <w:t>the</w:t>
-      </w:r>
-      <w:r>
-        <w:rPr>
-          <w:bCs/>
-          <w:kern w:val="0"/>
-        </w:rPr>
-        <w:t xml:space="preserve"> </w:t>
-      </w:r>
-      <w:r>
-        <w:rPr>
-          <w:bCs/>
-          <w:kern w:val="0"/>
-        </w:rPr>
-        <w:t>O</w:t>
-      </w:r>
-      <w:r>
-        <w:rPr>
-          <w:bCs/>
-          <w:kern w:val="0"/>
-        </w:rPr>
-        <w:t xml:space="preserve">ptions were granted to eligible participants to subscribe for an aggregate of </w:t>
-      </w:r>
-      <w:r>
-        <w:rPr>
-          <w:bCs/>
-          <w:kern w:val="0"/>
-        </w:rPr>
-        <w:t>23</w:t>
-      </w:r>
-      <w:r>
-        <w:rPr>
-          <w:bCs/>
-          <w:kern w:val="0"/>
-        </w:rPr>
-        <w:t xml:space="preserve">,000,000 ordinary shares of the </w:t>
-      </w:r>
-      <w:r>
-        <w:rPr>
-          <w:bCs/>
-          <w:kern w:val="0"/>
-        </w:rPr>
-        <w:t>Client</w:t>
-      </w:r>
-      <w:r>
-        <w:rPr>
-          <w:bCs/>
-          <w:kern w:val="0"/>
-        </w:rPr>
-        <w:t>.</w:t>
-      </w:r>
-      <w:r>
-        <w:rPr>
-          <w:bCs/>
-          <w:kern w:val="0"/>
-        </w:rPr>
-        <w:t>]</w:t>
+        <w:t>[Pursuant to the announcement dated 13 May 2022 made by the Client, the Options were granted to eligible participants to subscribe for an aggregate of 23,000,000 ordinary shares of the Client.]</w:t>
       </w:r>
     </w:p>
     <w:p>
@@ -5757,7 +5490,6 @@
                 <w:kern w:val="0"/>
                 <w:sz w:val="20"/>
                 <w:szCs w:val="20"/>
-                <w:highlight w:val="green"/>
               </w:rPr>
             </w:pPr>
             <w:r>
@@ -5767,7 +5499,6 @@
                 <w:bCs/>
                 <w:sz w:val="20"/>
                 <w:szCs w:val="20"/>
-                <w:highlight w:val="green"/>
               </w:rPr>
               <w:t>T</w:t>
             </w:r>
@@ -5777,7 +5508,6 @@
                 <w:bCs/>
                 <w:sz w:val="20"/>
                 <w:szCs w:val="20"/>
-                <w:highlight w:val="green"/>
               </w:rPr>
               <w:t>erm</w:t>
             </w:r>
@@ -5803,7 +5533,6 @@
                 <w:kern w:val="0"/>
                 <w:sz w:val="20"/>
                 <w:szCs w:val="20"/>
-                <w:highlight w:val="green"/>
               </w:rPr>
             </w:pPr>
             <w:r>
@@ -5813,7 +5542,6 @@
                 <w:bCs/>
                 <w:sz w:val="20"/>
                 <w:szCs w:val="20"/>
-                <w:highlight w:val="green"/>
               </w:rPr>
               <w:t>D</w:t>
             </w:r>
@@ -5823,7 +5551,6 @@
                 <w:bCs/>
                 <w:sz w:val="20"/>
                 <w:szCs w:val="20"/>
-                <w:highlight w:val="green"/>
               </w:rPr>
               <w:t>escription</w:t>
             </w:r>
@@ -5851,14 +5578,12 @@
                 <w:kern w:val="0"/>
                 <w:sz w:val="20"/>
                 <w:szCs w:val="20"/>
-                <w:highlight w:val="green"/>
               </w:rPr>
             </w:pPr>
             <w:r>
               <w:rPr>
                 <w:sz w:val="20"/>
                 <w:szCs w:val="20"/>
-                <w:highlight w:val="green"/>
               </w:rPr>
               <w:t xml:space="preserve">Number of </w:t>
             </w:r>
@@ -5866,7 +5591,6 @@
               <w:rPr>
                 <w:sz w:val="20"/>
                 <w:szCs w:val="20"/>
-                <w:highlight w:val="green"/>
               </w:rPr>
               <w:t>the Options granted</w:t>
             </w:r>
@@ -5890,7 +5614,6 @@
               <w:rPr>
                 <w:sz w:val="20"/>
                 <w:szCs w:val="20"/>
-                <w:highlight w:val="green"/>
                 <w:lang w:val="en-US"/>
               </w:rPr>
             </w:pPr>
@@ -5898,24 +5621,14 @@
               <w:rPr>
                 <w:sz w:val="20"/>
                 <w:szCs w:val="20"/>
-                <w:highlight w:val="green"/>
-              </w:rPr>
-              <w:t>{</w:t>
-            </w:r>
-            <w:r>
-              <w:rPr>
-                <w:sz w:val="20"/>
-                <w:szCs w:val="20"/>
-                <w:highlight w:val="green"/>
-              </w:rPr>
-              <w:t>{</w:t>
+              </w:rPr>
+              <w:t>{{</w:t>
             </w:r>
             <w:proofErr w:type="spellStart"/>
             <w:r>
               <w:rPr>
                 <w:sz w:val="20"/>
                 <w:szCs w:val="20"/>
-                <w:highlight w:val="green"/>
                 <w:lang w:val="en-US"/>
               </w:rPr>
               <w:t>TotalNoOfShareOptions</w:t>
@@ -5925,7 +5638,6 @@
               <w:rPr>
                 <w:sz w:val="20"/>
                 <w:szCs w:val="20"/>
-                <w:highlight w:val="green"/>
               </w:rPr>
               <w:t>}}</w:t>
             </w:r>
@@ -5950,14 +5662,12 @@
                 <w:kern w:val="0"/>
                 <w:sz w:val="20"/>
                 <w:szCs w:val="20"/>
-                <w:highlight w:val="green"/>
               </w:rPr>
             </w:pPr>
             <w:r>
               <w:rPr>
                 <w:sz w:val="20"/>
                 <w:szCs w:val="20"/>
-                <w:highlight w:val="green"/>
               </w:rPr>
               <w:t>Exercise price per share</w:t>
             </w:r>
@@ -5980,14 +5690,12 @@
                 <w:kern w:val="0"/>
                 <w:sz w:val="20"/>
                 <w:szCs w:val="20"/>
-                <w:highlight w:val="green"/>
               </w:rPr>
             </w:pPr>
             <w:r>
               <w:rPr>
                 <w:sz w:val="20"/>
                 <w:szCs w:val="20"/>
-                <w:highlight w:val="green"/>
               </w:rPr>
               <w:t>{{</w:t>
             </w:r>
@@ -5996,7 +5704,6 @@
               <w:rPr>
                 <w:sz w:val="20"/>
                 <w:szCs w:val="20"/>
-                <w:highlight w:val="green"/>
               </w:rPr>
               <w:t>ExercisePrice</w:t>
             </w:r>
@@ -6005,7 +5712,6 @@
               <w:rPr>
                 <w:sz w:val="20"/>
                 <w:szCs w:val="20"/>
-                <w:highlight w:val="green"/>
               </w:rPr>
               <w:t>}}</w:t>
             </w:r>
@@ -6030,14 +5736,12 @@
                 <w:kern w:val="0"/>
                 <w:sz w:val="20"/>
                 <w:szCs w:val="20"/>
-                <w:highlight w:val="green"/>
               </w:rPr>
             </w:pPr>
             <w:r>
               <w:rPr>
                 <w:sz w:val="20"/>
                 <w:szCs w:val="20"/>
-                <w:highlight w:val="green"/>
               </w:rPr>
               <w:t>Grant date</w:t>
             </w:r>
@@ -6060,14 +5764,12 @@
                 <w:kern w:val="0"/>
                 <w:sz w:val="20"/>
                 <w:szCs w:val="20"/>
-                <w:highlight w:val="green"/>
               </w:rPr>
             </w:pPr>
             <w:r>
               <w:rPr>
                 <w:sz w:val="20"/>
                 <w:szCs w:val="20"/>
-                <w:highlight w:val="green"/>
               </w:rPr>
               <w:t>{{</w:t>
             </w:r>
@@ -6076,7 +5778,6 @@
               <w:rPr>
                 <w:sz w:val="20"/>
                 <w:szCs w:val="20"/>
-                <w:highlight w:val="green"/>
               </w:rPr>
               <w:t>GrantDate</w:t>
             </w:r>
@@ -6085,7 +5786,6 @@
               <w:rPr>
                 <w:sz w:val="20"/>
                 <w:szCs w:val="20"/>
-                <w:highlight w:val="green"/>
               </w:rPr>
               <w:t>}}</w:t>
             </w:r>
@@ -6110,14 +5810,12 @@
                 <w:kern w:val="0"/>
                 <w:sz w:val="20"/>
                 <w:szCs w:val="20"/>
-                <w:highlight w:val="green"/>
               </w:rPr>
             </w:pPr>
             <w:r>
               <w:rPr>
                 <w:sz w:val="20"/>
                 <w:szCs w:val="20"/>
-                <w:highlight w:val="green"/>
                 <w:lang w:eastAsia="zh-HK"/>
               </w:rPr>
               <w:t>Exercise period</w:t>
@@ -6141,14 +5839,12 @@
                 <w:kern w:val="0"/>
                 <w:sz w:val="20"/>
                 <w:szCs w:val="20"/>
-                <w:highlight w:val="green"/>
               </w:rPr>
             </w:pPr>
             <w:r>
               <w:rPr>
                 <w:sz w:val="20"/>
                 <w:szCs w:val="20"/>
-                <w:highlight w:val="green"/>
               </w:rPr>
               <w:t>{{</w:t>
             </w:r>
@@ -6157,7 +5853,6 @@
               <w:rPr>
                 <w:sz w:val="20"/>
                 <w:szCs w:val="20"/>
-                <w:highlight w:val="green"/>
               </w:rPr>
               <w:t>TimeToMaturity</w:t>
             </w:r>
@@ -6166,7 +5861,6 @@
               <w:rPr>
                 <w:sz w:val="20"/>
                 <w:szCs w:val="20"/>
-                <w:highlight w:val="green"/>
               </w:rPr>
               <w:t>}}</w:t>
             </w:r>
@@ -6191,14 +5885,12 @@
                 <w:kern w:val="0"/>
                 <w:sz w:val="20"/>
                 <w:szCs w:val="20"/>
-                <w:highlight w:val="green"/>
               </w:rPr>
             </w:pPr>
             <w:r>
               <w:rPr>
                 <w:sz w:val="20"/>
                 <w:szCs w:val="20"/>
-                <w:highlight w:val="green"/>
                 <w:lang w:eastAsia="zh-HK"/>
               </w:rPr>
               <w:t>Vesting period</w:t>
@@ -6222,14 +5914,12 @@
                 <w:kern w:val="0"/>
                 <w:sz w:val="20"/>
                 <w:szCs w:val="20"/>
-                <w:highlight w:val="green"/>
               </w:rPr>
             </w:pPr>
             <w:r>
               <w:rPr>
                 <w:sz w:val="20"/>
                 <w:szCs w:val="20"/>
-                <w:highlight w:val="green"/>
               </w:rPr>
               <w:t>{{TimeToVest}}</w:t>
             </w:r>
@@ -6280,10 +5970,7 @@
       <w:bookmarkStart w:id="31" w:name="_Toc474149050"/>
       <w:bookmarkStart w:id="32" w:name="_Toc192264810"/>
       <w:r>
-        <w:t>SOURCES</w:t>
-      </w:r>
-      <w:r>
-        <w:t xml:space="preserve"> OF INFORMATION</w:t>
+        <w:t>SOURCES OF INFORMATION</w:t>
       </w:r>
       <w:bookmarkEnd w:id="26"/>
       <w:bookmarkEnd w:id="27"/>
@@ -7379,7 +7066,6 @@
                 <w:kern w:val="0"/>
                 <w:sz w:val="20"/>
                 <w:szCs w:val="20"/>
-                <w:highlight w:val="green"/>
               </w:rPr>
             </w:pPr>
             <w:r>
@@ -7388,7 +7074,6 @@
                 <w:kern w:val="0"/>
                 <w:sz w:val="20"/>
                 <w:szCs w:val="20"/>
-                <w:highlight w:val="green"/>
               </w:rPr>
               <w:t>Parameter</w:t>
             </w:r>
@@ -7415,7 +7100,6 @@
                 <w:kern w:val="0"/>
                 <w:sz w:val="20"/>
                 <w:szCs w:val="20"/>
-                <w:highlight w:val="green"/>
               </w:rPr>
             </w:pPr>
             <w:r>
@@ -7424,7 +7108,6 @@
                 <w:kern w:val="0"/>
                 <w:sz w:val="20"/>
                 <w:szCs w:val="20"/>
-                <w:highlight w:val="green"/>
               </w:rPr>
               <w:t>Input</w:t>
             </w:r>
@@ -7521,7 +7204,6 @@
                 <w:kern w:val="0"/>
                 <w:sz w:val="20"/>
                 <w:szCs w:val="20"/>
-                <w:highlight w:val="green"/>
               </w:rPr>
             </w:pPr>
             <w:r>
@@ -7530,7 +7212,6 @@
                 <w:kern w:val="0"/>
                 <w:sz w:val="20"/>
                 <w:szCs w:val="20"/>
-                <w:highlight w:val="green"/>
               </w:rPr>
               <w:t>Spot price</w:t>
             </w:r>
@@ -7557,7 +7238,6 @@
                 <w:kern w:val="0"/>
                 <w:sz w:val="20"/>
                 <w:szCs w:val="20"/>
-                <w:highlight w:val="green"/>
               </w:rPr>
             </w:pPr>
             <w:r>
@@ -7566,7 +7246,6 @@
                 <w:kern w:val="0"/>
                 <w:sz w:val="20"/>
                 <w:szCs w:val="20"/>
-                <w:highlight w:val="green"/>
               </w:rPr>
               <w:t>{{</w:t>
             </w:r>
@@ -7577,40 +7256,47 @@
                 <w:kern w:val="0"/>
                 <w:sz w:val="20"/>
                 <w:szCs w:val="20"/>
-                <w:highlight w:val="green"/>
               </w:rPr>
               <w:t>CurrencyUnit</w:t>
             </w:r>
             <w:proofErr w:type="spellEnd"/>
+            <w:proofErr w:type="gramStart"/>
             <w:r>
               <w:rPr>
                 <w:bCs/>
                 <w:kern w:val="0"/>
                 <w:sz w:val="20"/>
                 <w:szCs w:val="20"/>
-                <w:highlight w:val="green"/>
-              </w:rPr>
-              <w:t>}}{{</w:t>
-            </w:r>
-            <w:proofErr w:type="spellStart"/>
+              </w:rPr>
+              <w:t>}}{</w:t>
+            </w:r>
+            <w:proofErr w:type="gramEnd"/>
             <w:r>
               <w:rPr>
                 <w:bCs/>
                 <w:kern w:val="0"/>
                 <w:sz w:val="20"/>
                 <w:szCs w:val="20"/>
-                <w:highlight w:val="green"/>
-              </w:rPr>
-              <w:t>SpotPrice</w:t>
-            </w:r>
-            <w:proofErr w:type="spellEnd"/>
+              </w:rPr>
+              <w:t>{</w:t>
+            </w:r>
+            <w:proofErr w:type="spellStart"/>
             <w:r>
               <w:rPr>
                 <w:bCs/>
                 <w:kern w:val="0"/>
                 <w:sz w:val="20"/>
                 <w:szCs w:val="20"/>
-                <w:highlight w:val="green"/>
+              </w:rPr>
+              <w:t>SpotPrice</w:t>
+            </w:r>
+            <w:proofErr w:type="spellEnd"/>
+            <w:r>
+              <w:rPr>
+                <w:bCs/>
+                <w:kern w:val="0"/>
+                <w:sz w:val="20"/>
+                <w:szCs w:val="20"/>
               </w:rPr>
               <w:t>}}</w:t>
             </w:r>
@@ -7680,34 +7366,7 @@
                 <w:sz w:val="20"/>
                 <w:szCs w:val="20"/>
               </w:rPr>
-              <w:t>C</w:t>
-            </w:r>
-            <w:r>
-              <w:rPr>
-                <w:bCs/>
-                <w:kern w:val="0"/>
-                <w:sz w:val="20"/>
-                <w:szCs w:val="20"/>
-              </w:rPr>
-              <w:t xml:space="preserve">losing price of the </w:t>
-            </w:r>
-            <w:r>
-              <w:rPr>
-                <w:bCs/>
-                <w:kern w:val="0"/>
-                <w:sz w:val="20"/>
-                <w:szCs w:val="20"/>
-              </w:rPr>
-              <w:t>Client</w:t>
-            </w:r>
-            <w:r>
-              <w:rPr>
-                <w:bCs/>
-                <w:kern w:val="0"/>
-                <w:sz w:val="20"/>
-                <w:szCs w:val="20"/>
-              </w:rPr>
-              <w:t xml:space="preserve"> as at the Valuation Date</w:t>
+              <w:t>Closing price of the Client as at the Valuation Date</w:t>
             </w:r>
           </w:p>
         </w:tc>
@@ -7731,7 +7390,6 @@
                 <w:kern w:val="0"/>
                 <w:sz w:val="20"/>
                 <w:szCs w:val="20"/>
-                <w:highlight w:val="green"/>
               </w:rPr>
             </w:pPr>
             <w:r>
@@ -7740,7 +7398,6 @@
                 <w:kern w:val="0"/>
                 <w:sz w:val="20"/>
                 <w:szCs w:val="20"/>
-                <w:highlight w:val="green"/>
               </w:rPr>
               <w:t>Exercise price</w:t>
             </w:r>
@@ -7764,7 +7421,6 @@
                 <w:kern w:val="0"/>
                 <w:sz w:val="20"/>
                 <w:szCs w:val="20"/>
-                <w:highlight w:val="green"/>
               </w:rPr>
             </w:pPr>
             <w:r>
@@ -7773,7 +7429,6 @@
                 <w:kern w:val="0"/>
                 <w:sz w:val="20"/>
                 <w:szCs w:val="20"/>
-                <w:highlight w:val="green"/>
               </w:rPr>
               <w:t>{{</w:t>
             </w:r>
@@ -7784,40 +7439,47 @@
                 <w:kern w:val="0"/>
                 <w:sz w:val="20"/>
                 <w:szCs w:val="20"/>
-                <w:highlight w:val="green"/>
               </w:rPr>
               <w:t>CurrencyUnit</w:t>
             </w:r>
             <w:proofErr w:type="spellEnd"/>
+            <w:proofErr w:type="gramStart"/>
             <w:r>
               <w:rPr>
                 <w:bCs/>
                 <w:kern w:val="0"/>
                 <w:sz w:val="20"/>
                 <w:szCs w:val="20"/>
-                <w:highlight w:val="green"/>
-              </w:rPr>
-              <w:t>}}{{</w:t>
-            </w:r>
-            <w:proofErr w:type="spellStart"/>
+              </w:rPr>
+              <w:t>}}{</w:t>
+            </w:r>
+            <w:proofErr w:type="gramEnd"/>
             <w:r>
               <w:rPr>
                 <w:bCs/>
                 <w:kern w:val="0"/>
                 <w:sz w:val="20"/>
                 <w:szCs w:val="20"/>
-                <w:highlight w:val="green"/>
-              </w:rPr>
-              <w:t>ExercisePrice</w:t>
-            </w:r>
-            <w:proofErr w:type="spellEnd"/>
+              </w:rPr>
+              <w:t>{</w:t>
+            </w:r>
+            <w:proofErr w:type="spellStart"/>
             <w:r>
               <w:rPr>
                 <w:bCs/>
                 <w:kern w:val="0"/>
                 <w:sz w:val="20"/>
                 <w:szCs w:val="20"/>
-                <w:highlight w:val="green"/>
+              </w:rPr>
+              <w:t>ExercisePrice</w:t>
+            </w:r>
+            <w:proofErr w:type="spellEnd"/>
+            <w:r>
+              <w:rPr>
+                <w:bCs/>
+                <w:kern w:val="0"/>
+                <w:sz w:val="20"/>
+                <w:szCs w:val="20"/>
               </w:rPr>
               <w:t>}}</w:t>
             </w:r>
@@ -7905,7 +7567,6 @@
                 <w:kern w:val="0"/>
                 <w:sz w:val="20"/>
                 <w:szCs w:val="20"/>
-                <w:highlight w:val="green"/>
               </w:rPr>
             </w:pPr>
             <w:r>
@@ -7914,7 +7575,6 @@
                 <w:kern w:val="0"/>
                 <w:sz w:val="20"/>
                 <w:szCs w:val="20"/>
-                <w:highlight w:val="green"/>
               </w:rPr>
               <w:t>Expected dividend yield</w:t>
             </w:r>
@@ -7938,7 +7598,6 @@
                 <w:kern w:val="0"/>
                 <w:sz w:val="20"/>
                 <w:szCs w:val="20"/>
-                <w:highlight w:val="green"/>
               </w:rPr>
             </w:pPr>
             <w:r>
@@ -7947,7 +7606,6 @@
                 <w:kern w:val="0"/>
                 <w:sz w:val="20"/>
                 <w:szCs w:val="20"/>
-                <w:highlight w:val="green"/>
               </w:rPr>
               <w:t>{{</w:t>
             </w:r>
@@ -7958,7 +7616,6 @@
                 <w:kern w:val="0"/>
                 <w:sz w:val="20"/>
                 <w:szCs w:val="20"/>
-                <w:highlight w:val="green"/>
               </w:rPr>
               <w:t>DividendYield</w:t>
             </w:r>
@@ -7969,7 +7626,6 @@
                 <w:kern w:val="0"/>
                 <w:sz w:val="20"/>
                 <w:szCs w:val="20"/>
-                <w:highlight w:val="green"/>
               </w:rPr>
               <w:t>}}</w:t>
             </w:r>
@@ -8033,16 +7689,7 @@
                 <w:sz w:val="20"/>
                 <w:szCs w:val="20"/>
               </w:rPr>
-              <w:t xml:space="preserve">Historical dividend yield of the </w:t>
-            </w:r>
-            <w:r>
-              <w:rPr>
-                <w:bCs/>
-                <w:kern w:val="0"/>
-                <w:sz w:val="20"/>
-                <w:szCs w:val="20"/>
-              </w:rPr>
-              <w:t>Client</w:t>
+              <w:t>Historical dividend yield of the Client</w:t>
             </w:r>
           </w:p>
         </w:tc>
@@ -8066,7 +7713,6 @@
                 <w:kern w:val="0"/>
                 <w:sz w:val="20"/>
                 <w:szCs w:val="20"/>
-                <w:highlight w:val="green"/>
               </w:rPr>
             </w:pPr>
             <w:r>
@@ -8075,7 +7721,6 @@
                 <w:kern w:val="0"/>
                 <w:sz w:val="20"/>
                 <w:szCs w:val="20"/>
-                <w:highlight w:val="green"/>
               </w:rPr>
               <w:t>Risk-free rate</w:t>
             </w:r>
@@ -8099,7 +7744,6 @@
                 <w:kern w:val="0"/>
                 <w:sz w:val="20"/>
                 <w:szCs w:val="20"/>
-                <w:highlight w:val="green"/>
               </w:rPr>
             </w:pPr>
             <w:r>
@@ -8108,7 +7752,6 @@
                 <w:kern w:val="0"/>
                 <w:sz w:val="20"/>
                 <w:szCs w:val="20"/>
-                <w:highlight w:val="green"/>
               </w:rPr>
               <w:t>{{</w:t>
             </w:r>
@@ -8119,7 +7762,6 @@
                 <w:kern w:val="0"/>
                 <w:sz w:val="20"/>
                 <w:szCs w:val="20"/>
-                <w:highlight w:val="green"/>
               </w:rPr>
               <w:t>RiskFreeRate</w:t>
             </w:r>
@@ -8130,7 +7772,6 @@
                 <w:kern w:val="0"/>
                 <w:sz w:val="20"/>
                 <w:szCs w:val="20"/>
-                <w:highlight w:val="green"/>
               </w:rPr>
               <w:t>}}</w:t>
             </w:r>
@@ -8218,7 +7859,6 @@
                 <w:kern w:val="0"/>
                 <w:sz w:val="20"/>
                 <w:szCs w:val="20"/>
-                <w:highlight w:val="green"/>
               </w:rPr>
             </w:pPr>
             <w:r>
@@ -8227,7 +7867,6 @@
                 <w:kern w:val="0"/>
                 <w:sz w:val="20"/>
                 <w:szCs w:val="20"/>
-                <w:highlight w:val="green"/>
               </w:rPr>
               <w:t>Expected volatility</w:t>
             </w:r>
@@ -8251,7 +7890,6 @@
                 <w:kern w:val="0"/>
                 <w:sz w:val="20"/>
                 <w:szCs w:val="20"/>
-                <w:highlight w:val="green"/>
               </w:rPr>
             </w:pPr>
             <w:r>
@@ -8260,7 +7898,6 @@
                 <w:kern w:val="0"/>
                 <w:sz w:val="20"/>
                 <w:szCs w:val="20"/>
-                <w:highlight w:val="green"/>
               </w:rPr>
               <w:t>{{Volatility}}</w:t>
             </w:r>
@@ -8324,25 +7961,7 @@
                 <w:sz w:val="20"/>
                 <w:szCs w:val="20"/>
               </w:rPr>
-              <w:t>H</w:t>
-            </w:r>
-            <w:r>
-              <w:rPr>
-                <w:bCs/>
-                <w:kern w:val="0"/>
-                <w:sz w:val="20"/>
-                <w:szCs w:val="20"/>
-              </w:rPr>
-              <w:t>istorical volatility of the</w:t>
-            </w:r>
-            <w:r>
-              <w:rPr>
-                <w:bCs/>
-                <w:kern w:val="0"/>
-                <w:sz w:val="20"/>
-                <w:szCs w:val="20"/>
-              </w:rPr>
-              <w:t xml:space="preserve"> Client</w:t>
+              <w:t>Historical volatility of the Client</w:t>
             </w:r>
           </w:p>
         </w:tc>
@@ -8366,7 +7985,6 @@
                 <w:kern w:val="0"/>
                 <w:sz w:val="20"/>
                 <w:szCs w:val="20"/>
-                <w:highlight w:val="green"/>
               </w:rPr>
             </w:pPr>
             <w:r>
@@ -8375,7 +7993,6 @@
                 <w:kern w:val="0"/>
                 <w:sz w:val="20"/>
                 <w:szCs w:val="20"/>
-                <w:highlight w:val="green"/>
               </w:rPr>
               <w:t>Year to expiry</w:t>
             </w:r>
@@ -8399,14 +8016,12 @@
                 <w:kern w:val="0"/>
                 <w:sz w:val="20"/>
                 <w:szCs w:val="20"/>
-                <w:highlight w:val="green"/>
               </w:rPr>
             </w:pPr>
             <w:r>
               <w:rPr>
                 <w:sz w:val="20"/>
                 <w:szCs w:val="20"/>
-                <w:highlight w:val="green"/>
               </w:rPr>
               <w:t>{{</w:t>
             </w:r>
@@ -8415,7 +8030,6 @@
               <w:rPr>
                 <w:sz w:val="20"/>
                 <w:szCs w:val="20"/>
-                <w:highlight w:val="green"/>
               </w:rPr>
               <w:t>TimeToMaturity</w:t>
             </w:r>
@@ -8424,7 +8038,6 @@
               <w:rPr>
                 <w:sz w:val="20"/>
                 <w:szCs w:val="20"/>
-                <w:highlight w:val="green"/>
               </w:rPr>
               <w:t>}}</w:t>
             </w:r>
@@ -8512,7 +8125,6 @@
                 <w:kern w:val="0"/>
                 <w:sz w:val="20"/>
                 <w:szCs w:val="20"/>
-                <w:highlight w:val="green"/>
               </w:rPr>
             </w:pPr>
             <w:r>
@@ -8521,7 +8133,6 @@
                 <w:kern w:val="0"/>
                 <w:sz w:val="20"/>
                 <w:szCs w:val="20"/>
-                <w:highlight w:val="green"/>
               </w:rPr>
               <w:t>Vesting date</w:t>
             </w:r>
@@ -8545,7 +8156,6 @@
                 <w:kern w:val="0"/>
                 <w:sz w:val="20"/>
                 <w:szCs w:val="20"/>
-                <w:highlight w:val="green"/>
                 <w:lang w:val="en-US"/>
               </w:rPr>
             </w:pPr>
@@ -8555,7 +8165,6 @@
                 <w:kern w:val="0"/>
                 <w:sz w:val="20"/>
                 <w:szCs w:val="20"/>
-                <w:highlight w:val="green"/>
               </w:rPr>
               <w:t>{{TimeToVest}}</w:t>
             </w:r>
@@ -8643,7 +8252,6 @@
                 <w:kern w:val="0"/>
                 <w:sz w:val="20"/>
                 <w:szCs w:val="20"/>
-                <w:highlight w:val="green"/>
               </w:rPr>
             </w:pPr>
             <w:r>
@@ -8652,7 +8260,6 @@
                 <w:kern w:val="0"/>
                 <w:sz w:val="20"/>
                 <w:szCs w:val="20"/>
-                <w:highlight w:val="green"/>
               </w:rPr>
               <w:t>Early exercise multiple</w:t>
             </w:r>
@@ -8676,7 +8283,6 @@
                 <w:kern w:val="0"/>
                 <w:sz w:val="20"/>
                 <w:szCs w:val="20"/>
-                <w:highlight w:val="green"/>
                 <w:lang w:val="en-US"/>
               </w:rPr>
             </w:pPr>
@@ -8686,7 +8292,6 @@
                 <w:kern w:val="0"/>
                 <w:sz w:val="20"/>
                 <w:szCs w:val="20"/>
-                <w:highlight w:val="green"/>
               </w:rPr>
               <w:t>{{</w:t>
             </w:r>
@@ -8697,7 +8302,6 @@
                 <w:kern w:val="0"/>
                 <w:sz w:val="20"/>
                 <w:szCs w:val="20"/>
-                <w:highlight w:val="green"/>
                 <w:lang w:val="en-US"/>
               </w:rPr>
               <w:t>ExerciseMultipleforEmployee</w:t>
@@ -8709,7 +8313,6 @@
                 <w:kern w:val="0"/>
                 <w:sz w:val="20"/>
                 <w:szCs w:val="20"/>
-                <w:highlight w:val="green"/>
               </w:rPr>
               <w:t>}} for employee, {{</w:t>
             </w:r>
@@ -8720,7 +8323,6 @@
                 <w:kern w:val="0"/>
                 <w:sz w:val="20"/>
                 <w:szCs w:val="20"/>
-                <w:highlight w:val="green"/>
                 <w:lang w:val="en-US"/>
               </w:rPr>
               <w:t>ExerciseMultipleforDirector</w:t>
@@ -8732,7 +8334,6 @@
                 <w:kern w:val="0"/>
                 <w:sz w:val="20"/>
                 <w:szCs w:val="20"/>
-                <w:highlight w:val="green"/>
               </w:rPr>
               <w:t>}} for director</w:t>
             </w:r>
@@ -8765,7 +8366,6 @@
                 <w:kern w:val="0"/>
                 <w:sz w:val="20"/>
                 <w:szCs w:val="20"/>
-                <w:highlight w:val="red"/>
               </w:rPr>
               <w:t>{{</w:t>
             </w:r>
@@ -8777,7 +8377,6 @@
                 <w:kern w:val="0"/>
                 <w:sz w:val="20"/>
                 <w:szCs w:val="20"/>
-                <w:highlight w:val="red"/>
               </w:rPr>
               <w:t>ExerciseMultipleSource</w:t>
             </w:r>
@@ -8789,7 +8388,6 @@
                 <w:kern w:val="0"/>
                 <w:sz w:val="20"/>
                 <w:szCs w:val="20"/>
-                <w:highlight w:val="red"/>
               </w:rPr>
               <w:t>}}</w:t>
             </w:r>
@@ -9230,10 +8828,185 @@
           <w:bCs/>
           <w:kern w:val="0"/>
         </w:rPr>
-        <w:t>Our conclusion of the value is derived from generally accepted valuation procedures and practices that rely substantially on the use of various assumptions and the consideration of many uncertainties, not all of which can be easily quantified or ascertained.</w:t>
-      </w:r>
-      <w:r>
-        <w:rPr>
+        <w:t xml:space="preserve">Our conclusion of the value is derived from generally accepted valuation procedures and practices that rely substantially on the use of various assumptions and the consideration of many uncertainties, not all of which can be easily quantified or ascertained. </w:t>
+      </w:r>
+      <w:r>
+        <w:rPr>
+          <w:rFonts w:hint="eastAsia"/>
+          <w:bCs/>
+          <w:kern w:val="0"/>
+        </w:rPr>
+        <w:t>No opinion is intended to be expressed for matters which require legal</w:t>
+      </w:r>
+      <w:r>
+        <w:rPr>
+          <w:bCs/>
+          <w:kern w:val="0"/>
+        </w:rPr>
+        <w:t>, audit</w:t>
+      </w:r>
+      <w:r>
+        <w:rPr>
+          <w:rFonts w:hint="eastAsia"/>
+          <w:bCs/>
+          <w:kern w:val="0"/>
+        </w:rPr>
+        <w:t xml:space="preserve"> or other specialised expertise, which is out of valuers</w:t>
+      </w:r>
+      <w:r>
+        <w:rPr>
+          <w:bCs/>
+          <w:kern w:val="0"/>
+        </w:rPr>
+        <w:t xml:space="preserve">’ </w:t>
+      </w:r>
+      <w:r>
+        <w:rPr>
+          <w:rFonts w:hint="eastAsia"/>
+          <w:bCs/>
+          <w:kern w:val="0"/>
+        </w:rPr>
+        <w:t>capacity.</w:t>
+      </w:r>
+    </w:p>
+    <w:p>
+      <w:pPr>
+        <w:autoSpaceDE w:val="0"/>
+        <w:autoSpaceDN w:val="0"/>
+        <w:adjustRightInd w:val="0"/>
+        <w:snapToGrid w:val="0"/>
+        <w:spacing w:line="320" w:lineRule="exact"/>
+        <w:ind w:right="26"/>
+        <w:rPr>
+          <w:bCs/>
+          <w:kern w:val="0"/>
+        </w:rPr>
+      </w:pPr>
+    </w:p>
+    <w:p>
+      <w:pPr>
+        <w:autoSpaceDE w:val="0"/>
+        <w:autoSpaceDN w:val="0"/>
+        <w:adjustRightInd w:val="0"/>
+        <w:snapToGrid w:val="0"/>
+        <w:spacing w:line="320" w:lineRule="exact"/>
+        <w:ind w:right="26"/>
+        <w:rPr>
+          <w:bCs/>
+          <w:kern w:val="0"/>
+        </w:rPr>
+      </w:pPr>
+      <w:r>
+        <w:rPr>
+          <w:bCs/>
+          <w:kern w:val="0"/>
+        </w:rPr>
+        <w:t>In preparing this report, we emphasized that we relied on the accuracy, completeness and reasonableness of the financial information, forecast, assumptions and other data provided to us by the Client and/or its representatives. We did not carry out any work in the nature of an audit and neither are we required to express an audit or viability opinion. W</w:t>
+      </w:r>
+      <w:r>
+        <w:rPr>
+          <w:bCs/>
+          <w:szCs w:val="20"/>
+        </w:rPr>
+        <w:t xml:space="preserve">e are not liable for anything related to, or arising in any way or from, </w:t>
+      </w:r>
+      <w:r>
+        <w:rPr>
+          <w:bCs/>
+          <w:kern w:val="0"/>
+        </w:rPr>
+        <w:t xml:space="preserve">the </w:t>
+      </w:r>
+      <w:r>
+        <w:rPr>
+          <w:bCs/>
+          <w:szCs w:val="20"/>
+        </w:rPr>
+        <w:t xml:space="preserve">inaccuracy or insufficiency </w:t>
+      </w:r>
+      <w:r>
+        <w:rPr>
+          <w:bCs/>
+          <w:kern w:val="0"/>
+        </w:rPr>
+        <w:t>of such information. Our report was used as part of the analysis of the Client in reaching their conclusion of value and due to the above reasons, the ultimate responsibility of our derived value rests solely with the Client.</w:t>
+      </w:r>
+    </w:p>
+    <w:p>
+      <w:pPr>
+        <w:autoSpaceDE w:val="0"/>
+        <w:autoSpaceDN w:val="0"/>
+        <w:adjustRightInd w:val="0"/>
+        <w:snapToGrid w:val="0"/>
+        <w:spacing w:line="320" w:lineRule="exact"/>
+        <w:ind w:right="26"/>
+        <w:rPr>
+          <w:bCs/>
+          <w:kern w:val="0"/>
+        </w:rPr>
+      </w:pPr>
+    </w:p>
+    <w:p>
+      <w:pPr>
+        <w:autoSpaceDE w:val="0"/>
+        <w:autoSpaceDN w:val="0"/>
+        <w:adjustRightInd w:val="0"/>
+        <w:snapToGrid w:val="0"/>
+        <w:spacing w:line="320" w:lineRule="exact"/>
+        <w:ind w:right="26"/>
+        <w:rPr>
+          <w:bCs/>
+          <w:kern w:val="0"/>
+        </w:rPr>
+      </w:pPr>
+      <w:r>
+        <w:rPr>
+          <w:rFonts w:hint="eastAsia"/>
+          <w:bCs/>
+          <w:kern w:val="0"/>
+        </w:rPr>
+        <w:t xml:space="preserve">Public industry and statistical information have been obtained from </w:t>
+      </w:r>
+      <w:r>
+        <w:rPr>
+          <w:bCs/>
+          <w:kern w:val="0"/>
+        </w:rPr>
+        <w:t xml:space="preserve">the </w:t>
+      </w:r>
+      <w:r>
+        <w:rPr>
+          <w:rFonts w:hint="eastAsia"/>
+          <w:bCs/>
+          <w:kern w:val="0"/>
+        </w:rPr>
+        <w:t>sources</w:t>
+      </w:r>
+      <w:r>
+        <w:rPr>
+          <w:bCs/>
+          <w:kern w:val="0"/>
+        </w:rPr>
+        <w:t xml:space="preserve"> that </w:t>
+      </w:r>
+      <w:r>
+        <w:rPr>
+          <w:rFonts w:hint="eastAsia"/>
+          <w:bCs/>
+          <w:kern w:val="0"/>
+        </w:rPr>
+        <w:t>we deem to be reputabl</w:t>
+      </w:r>
+      <w:r>
+        <w:rPr>
+          <w:bCs/>
+          <w:kern w:val="0"/>
+        </w:rPr>
+        <w:t>e.</w:t>
+      </w:r>
+      <w:r>
+        <w:rPr>
+          <w:rFonts w:hint="eastAsia"/>
           <w:bCs/>
           <w:kern w:val="0"/>
         </w:rPr>
@@ -9241,18 +9014,25 @@
       </w:r>
       <w:r>
         <w:rPr>
+          <w:bCs/>
+          <w:kern w:val="0"/>
+        </w:rPr>
+        <w:t>H</w:t>
+      </w:r>
+      <w:r>
+        <w:rPr>
           <w:rFonts w:hint="eastAsia"/>
           <w:bCs/>
           <w:kern w:val="0"/>
         </w:rPr>
-        <w:t>No opinion is intended to be expressed for matters which require legal</w:t>
-      </w:r>
-      <w:r>
-        <w:rPr>
-          <w:bCs/>
-          <w:kern w:val="0"/>
-        </w:rPr>
-        <w:t>, audit</w:t>
+        <w:t xml:space="preserve">owever, we make no representation as to the accuracy </w:t>
+      </w:r>
+      <w:r>
+        <w:rPr>
+          <w:bCs/>
+          <w:kern w:val="0"/>
+        </w:rPr>
+        <w:t>and</w:t>
       </w:r>
       <w:r>
         <w:rPr>
@@ -9260,14 +9040,49 @@
           <w:bCs/>
           <w:kern w:val="0"/>
         </w:rPr>
-        <w:t xml:space="preserve"> or other specialised expertise, which is out of valuers</w:t>
-      </w:r>
-      <w:r>
-        <w:rPr>
-          <w:bCs/>
-          <w:kern w:val="0"/>
-        </w:rPr>
-        <w:t xml:space="preserve">’ </w:t>
+        <w:t xml:space="preserve"> completeness of such information, and have accepted the information without any </w:t>
+      </w:r>
+      <w:r>
+        <w:rPr>
+          <w:bCs/>
+          <w:kern w:val="0"/>
+        </w:rPr>
+        <w:t>verification.</w:t>
+      </w:r>
+    </w:p>
+    <w:p>
+      <w:pPr>
+        <w:autoSpaceDE w:val="0"/>
+        <w:autoSpaceDN w:val="0"/>
+        <w:adjustRightInd w:val="0"/>
+        <w:snapToGrid w:val="0"/>
+        <w:spacing w:line="320" w:lineRule="exact"/>
+        <w:ind w:right="26"/>
+        <w:rPr>
+          <w:bCs/>
+          <w:kern w:val="0"/>
+        </w:rPr>
+      </w:pPr>
+    </w:p>
+    <w:p>
+      <w:pPr>
+        <w:autoSpaceDE w:val="0"/>
+        <w:autoSpaceDN w:val="0"/>
+        <w:adjustRightInd w:val="0"/>
+        <w:snapToGrid w:val="0"/>
+        <w:spacing w:line="320" w:lineRule="exact"/>
+        <w:ind w:right="26"/>
+        <w:rPr>
+          <w:bCs/>
+          <w:kern w:val="0"/>
+        </w:rPr>
+      </w:pPr>
+      <w:r>
+        <w:rPr>
+          <w:bCs/>
+          <w:kern w:val="0"/>
+        </w:rPr>
+        <w:t>The Management has reviewed and agreed on the report, and confirmed the basis, assumptions, calculations and results are appropriate and reasonable.</w:t>
       </w:r>
       <w:r>
         <w:rPr>
@@ -9275,127 +9090,29 @@
           <w:bCs/>
           <w:kern w:val="0"/>
         </w:rPr>
-        <w:t>capacity.</w:t>
-      </w:r>
-    </w:p>
-    <w:p>
-      <w:pPr>
-        <w:autoSpaceDE w:val="0"/>
-        <w:autoSpaceDN w:val="0"/>
-        <w:adjustRightInd w:val="0"/>
-        <w:snapToGrid w:val="0"/>
-        <w:spacing w:line="320" w:lineRule="exact"/>
-        <w:ind w:right="26"/>
-        <w:rPr>
-          <w:bCs/>
-          <w:kern w:val="0"/>
-        </w:rPr>
-      </w:pPr>
-    </w:p>
-    <w:p>
-      <w:pPr>
-        <w:autoSpaceDE w:val="0"/>
-        <w:autoSpaceDN w:val="0"/>
-        <w:adjustRightInd w:val="0"/>
-        <w:snapToGrid w:val="0"/>
-        <w:spacing w:line="320" w:lineRule="exact"/>
-        <w:ind w:right="26"/>
-        <w:rPr>
-          <w:bCs/>
-          <w:kern w:val="0"/>
-        </w:rPr>
-      </w:pPr>
-      <w:r>
-        <w:rPr>
-          <w:bCs/>
-          <w:kern w:val="0"/>
-        </w:rPr>
-        <w:t xml:space="preserve">In preparing this </w:t>
-      </w:r>
-      <w:r>
-        <w:rPr>
-          <w:bCs/>
-          <w:kern w:val="0"/>
-        </w:rPr>
-        <w:t>report, we emphasized that we relied on the accuracy, completeness and reasonableness of the financial information, forecast, assumptions and other data provided to us by the Client and/or its representatives. We did not carry out any work in the nature of an audit and neither are we required to express an audit or viability opinion. W</w:t>
-      </w:r>
-      <w:r>
-        <w:rPr>
-          <w:bCs/>
-          <w:szCs w:val="20"/>
-        </w:rPr>
-        <w:t xml:space="preserve">e are not liable for anything related to, or arising in any way or from, </w:t>
-      </w:r>
-      <w:r>
-        <w:rPr>
-          <w:bCs/>
-          <w:kern w:val="0"/>
-        </w:rPr>
-        <w:t xml:space="preserve">the </w:t>
-      </w:r>
-      <w:r>
-        <w:rPr>
-          <w:bCs/>
-          <w:szCs w:val="20"/>
-        </w:rPr>
-        <w:t xml:space="preserve">inaccuracy or insufficiency </w:t>
-      </w:r>
-      <w:r>
-        <w:rPr>
-          <w:bCs/>
-          <w:kern w:val="0"/>
-        </w:rPr>
-        <w:t>of such information. Our report was used as part of the analysis of the Client in reaching their conclusion of value and due to the above reasons, the ultimate responsibility of our derived value rests solely with the</w:t>
-      </w:r>
-      <w:r>
-        <w:rPr>
-          <w:bCs/>
-          <w:kern w:val="0"/>
-        </w:rPr>
-        <w:t xml:space="preserve"> Client.</w:t>
-      </w:r>
-    </w:p>
-    <w:p>
-      <w:pPr>
-        <w:autoSpaceDE w:val="0"/>
-        <w:autoSpaceDN w:val="0"/>
-        <w:adjustRightInd w:val="0"/>
-        <w:snapToGrid w:val="0"/>
-        <w:spacing w:line="320" w:lineRule="exact"/>
-        <w:ind w:right="26"/>
-        <w:rPr>
-          <w:bCs/>
-          <w:kern w:val="0"/>
-        </w:rPr>
-      </w:pPr>
-    </w:p>
-    <w:p>
-      <w:pPr>
-        <w:autoSpaceDE w:val="0"/>
-        <w:autoSpaceDN w:val="0"/>
-        <w:adjustRightInd w:val="0"/>
-        <w:snapToGrid w:val="0"/>
-        <w:spacing w:line="320" w:lineRule="exact"/>
-        <w:ind w:right="26"/>
-        <w:rPr>
-          <w:bCs/>
-          <w:kern w:val="0"/>
-        </w:rPr>
-      </w:pPr>
+        <w:t xml:space="preserve"> The use of and/or the validity of the </w:t>
+      </w:r>
+      <w:r>
+        <w:rPr>
+          <w:bCs/>
+          <w:kern w:val="0"/>
+        </w:rPr>
+        <w:t>r</w:t>
+      </w:r>
       <w:r>
         <w:rPr>
           <w:rFonts w:hint="eastAsia"/>
           <w:bCs/>
           <w:kern w:val="0"/>
         </w:rPr>
-        <w:t xml:space="preserve">Public industry and statistical information have been obtained from </w:t>
-      </w:r>
-      <w:r>
-        <w:rPr>
-          <w:bCs/>
-          <w:kern w:val="0"/>
-        </w:rPr>
-        <w:t xml:space="preserve">the </w:t>
+        <w:t xml:space="preserve">eport is subject to the terms of </w:t>
+      </w:r>
+      <w:r>
+        <w:rPr>
+          <w:bCs/>
+          <w:kern w:val="0"/>
+        </w:rPr>
+        <w:t>proposal</w:t>
       </w:r>
       <w:r>
         <w:rPr>
@@ -9403,33 +9120,157 @@
           <w:bCs/>
           <w:kern w:val="0"/>
         </w:rPr>
-        <w:t>sources</w:t>
-      </w:r>
-      <w:r>
-        <w:rPr>
-          <w:bCs/>
-          <w:kern w:val="0"/>
-        </w:rPr>
-        <w:t xml:space="preserve"> that </w:t>
-      </w:r>
-      <w:r>
-        <w:rPr>
-          <w:rFonts w:hint="eastAsia"/>
-          <w:bCs/>
-          <w:kern w:val="0"/>
-        </w:rPr>
-        <w:t>we deem to be reputabl</w:t>
-      </w:r>
-      <w:r>
-        <w:rPr>
-          <w:bCs/>
-          <w:kern w:val="0"/>
-        </w:rPr>
-        <w:t>e.</w:t>
-      </w:r>
-      <w:r>
-        <w:rPr>
-          <w:rFonts w:hint="eastAsia"/>
+        <w:t xml:space="preserve"> and the full settlement of the fees and all the expenses.</w:t>
+      </w:r>
+    </w:p>
+    <w:p>
+      <w:pPr>
+        <w:autoSpaceDE w:val="0"/>
+        <w:autoSpaceDN w:val="0"/>
+        <w:adjustRightInd w:val="0"/>
+        <w:snapToGrid w:val="0"/>
+        <w:spacing w:line="320" w:lineRule="exact"/>
+        <w:ind w:right="26"/>
+        <w:rPr>
+          <w:bCs/>
+          <w:kern w:val="0"/>
+        </w:rPr>
+      </w:pPr>
+    </w:p>
+    <w:p>
+      <w:pPr>
+        <w:autoSpaceDE w:val="0"/>
+        <w:autoSpaceDN w:val="0"/>
+        <w:adjustRightInd w:val="0"/>
+        <w:snapToGrid w:val="0"/>
+        <w:spacing w:line="320" w:lineRule="exact"/>
+        <w:ind w:right="26"/>
+        <w:rPr>
+          <w:bCs/>
+          <w:kern w:val="0"/>
+        </w:rPr>
+      </w:pPr>
+      <w:r>
+        <w:rPr>
+          <w:bCs/>
+          <w:kern w:val="0"/>
+        </w:rPr>
+        <w:t xml:space="preserve">We assume that there are no hidden or unexpected conditions associated with the subject matter under review that might adversely affect the reported result. Further, we assume no responsibility for changes in market conditions, government policy or other events after the Valuation Date. We cannot provide assurance on the achievability of the results estimated by the Client. </w:t>
+      </w:r>
+    </w:p>
+    <w:p>
+      <w:pPr>
+        <w:autoSpaceDE w:val="0"/>
+        <w:autoSpaceDN w:val="0"/>
+        <w:adjustRightInd w:val="0"/>
+        <w:snapToGrid w:val="0"/>
+        <w:spacing w:line="320" w:lineRule="exact"/>
+        <w:ind w:right="26"/>
+        <w:rPr>
+          <w:bCs/>
+          <w:kern w:val="0"/>
+        </w:rPr>
+      </w:pPr>
+    </w:p>
+    <w:p>
+      <w:pPr>
+        <w:autoSpaceDE w:val="0"/>
+        <w:autoSpaceDN w:val="0"/>
+        <w:adjustRightInd w:val="0"/>
+        <w:snapToGrid w:val="0"/>
+        <w:spacing w:line="320" w:lineRule="exact"/>
+        <w:ind w:right="26"/>
+        <w:rPr>
+          <w:bCs/>
+          <w:kern w:val="0"/>
+        </w:rPr>
+      </w:pPr>
+      <w:r>
+        <w:rPr>
+          <w:bCs/>
+          <w:kern w:val="0"/>
+        </w:rPr>
+        <w:t xml:space="preserve">We have not investigated the title to or any legal liabilities of the </w:t>
+      </w:r>
+      <w:r>
+        <w:rPr>
+          <w:bCs/>
+          <w:kern w:val="0"/>
+        </w:rPr>
+        <w:t>Options</w:t>
+      </w:r>
+      <w:r>
+        <w:rPr>
+          <w:bCs/>
+          <w:kern w:val="0"/>
+        </w:rPr>
+        <w:t xml:space="preserve"> and have assumed no responsibility for the title to the </w:t>
+      </w:r>
+      <w:r>
+        <w:rPr>
+          <w:bCs/>
+          <w:kern w:val="0"/>
+        </w:rPr>
+        <w:t>Options</w:t>
+      </w:r>
+      <w:r>
+        <w:rPr>
+          <w:bCs/>
+          <w:kern w:val="0"/>
+        </w:rPr>
+        <w:t>.</w:t>
+      </w:r>
+    </w:p>
+    <w:p>
+      <w:pPr>
+        <w:autoSpaceDE w:val="0"/>
+        <w:autoSpaceDN w:val="0"/>
+        <w:adjustRightInd w:val="0"/>
+        <w:snapToGrid w:val="0"/>
+        <w:spacing w:line="320" w:lineRule="exact"/>
+        <w:ind w:right="26"/>
+        <w:rPr>
+          <w:bCs/>
+          <w:kern w:val="0"/>
+        </w:rPr>
+      </w:pPr>
+    </w:p>
+    <w:p>
+      <w:pPr>
+        <w:autoSpaceDE w:val="0"/>
+        <w:autoSpaceDN w:val="0"/>
+        <w:adjustRightInd w:val="0"/>
+        <w:snapToGrid w:val="0"/>
+        <w:spacing w:line="320" w:lineRule="exact"/>
+        <w:ind w:right="26"/>
+        <w:rPr>
+          <w:bCs/>
+          <w:kern w:val="0"/>
+        </w:rPr>
+      </w:pPr>
+      <w:r>
+        <w:rPr>
+          <w:bCs/>
+          <w:kern w:val="0"/>
+        </w:rPr>
+        <w:t xml:space="preserve">In accordance with our standard practices, we must state that this report is for the exclusive use of the party to whom it is addressed and for the specific </w:t>
+      </w:r>
+      <w:r>
+        <w:rPr>
+          <w:bCs/>
+          <w:kern w:val="0"/>
+        </w:rPr>
+        <w:t>intended use</w:t>
+      </w:r>
+      <w:r>
+        <w:rPr>
+          <w:bCs/>
+          <w:kern w:val="0"/>
+        </w:rPr>
+        <w:t xml:space="preserve"> stated above. Furthermore, the report and conclusion of value are not intended by the author, and should not be construed by the reader, to be investment advice in any manner whatsoever. The conclusion of value</w:t>
+      </w:r>
+      <w:r>
+        <w:rPr>
           <w:bCs/>
           <w:kern w:val="0"/>
         </w:rPr>
@@ -9440,285 +9281,64 @@
           <w:bCs/>
           <w:kern w:val="0"/>
         </w:rPr>
-        <w:t>H</w:t>
-      </w:r>
-      <w:r>
-        <w:rPr>
-          <w:rFonts w:hint="eastAsia"/>
-          <w:bCs/>
-          <w:kern w:val="0"/>
-        </w:rPr>
-        <w:t xml:space="preserve">owever, we make no representation as to the accuracy </w:t>
-      </w:r>
-      <w:r>
-        <w:rPr>
-          <w:bCs/>
-          <w:kern w:val="0"/>
-        </w:rPr>
-        <w:t>and</w:t>
-      </w:r>
-      <w:r>
-        <w:rPr>
-          <w:rFonts w:hint="eastAsia"/>
-          <w:bCs/>
-          <w:kern w:val="0"/>
-        </w:rPr>
-        <w:t xml:space="preserve"> completeness of such information, and have accepted the information without any </w:t>
-      </w:r>
-      <w:r>
-        <w:rPr>
-          <w:bCs/>
-          <w:kern w:val="0"/>
-        </w:rPr>
-        <w:t>verification.</w:t>
-      </w:r>
-    </w:p>
-    <w:p>
-      <w:pPr>
-        <w:autoSpaceDE w:val="0"/>
-        <w:autoSpaceDN w:val="0"/>
-        <w:adjustRightInd w:val="0"/>
-        <w:snapToGrid w:val="0"/>
-        <w:spacing w:line="320" w:lineRule="exact"/>
-        <w:ind w:right="26"/>
-        <w:rPr>
-          <w:bCs/>
-          <w:kern w:val="0"/>
-        </w:rPr>
-      </w:pPr>
-    </w:p>
-    <w:p>
-      <w:pPr>
-        <w:autoSpaceDE w:val="0"/>
-        <w:autoSpaceDN w:val="0"/>
-        <w:adjustRightInd w:val="0"/>
-        <w:snapToGrid w:val="0"/>
-        <w:spacing w:line="320" w:lineRule="exact"/>
-        <w:ind w:right="26"/>
-        <w:rPr>
-          <w:bCs/>
-          <w:kern w:val="0"/>
-        </w:rPr>
-      </w:pPr>
-      <w:r>
-        <w:rPr>
-          <w:bCs/>
-          <w:kern w:val="0"/>
-        </w:rPr>
-        <w:t>The Management has reviewed and agreed on the report</w:t>
-      </w:r>
-      <w:r>
-        <w:rPr>
-          <w:bCs/>
-          <w:kern w:val="0"/>
-        </w:rPr>
-        <w:t>,</w:t>
-      </w:r>
-      <w:r>
-        <w:rPr>
-          <w:bCs/>
-          <w:kern w:val="0"/>
-        </w:rPr>
-        <w:t xml:space="preserve"> and confirmed the</w:t>
-      </w:r>
-      <w:r>
-        <w:rPr>
-          <w:bCs/>
-          <w:kern w:val="0"/>
-        </w:rPr>
-        <w:t xml:space="preserve"> </w:t>
-      </w:r>
-      <w:r>
-        <w:rPr>
-          <w:bCs/>
-          <w:kern w:val="0"/>
-        </w:rPr>
-        <w:t>basis, assumptions, calculations and results are appropriate and reasonable.</w:t>
-      </w:r>
-      <w:r>
-        <w:rPr>
-          <w:rFonts w:hint="eastAsia"/>
-          <w:bCs/>
-          <w:kern w:val="0"/>
-        </w:rPr>
-        <w:t xml:space="preserve"> The use of and/or the validity of the </w:t>
-      </w:r>
-      <w:r>
-        <w:rPr>
-          <w:bCs/>
-          <w:kern w:val="0"/>
-        </w:rPr>
-        <w:t>r</w:t>
-      </w:r>
-      <w:r>
-        <w:rPr>
-          <w:rFonts w:hint="eastAsia"/>
-          <w:bCs/>
-          <w:kern w:val="0"/>
-        </w:rPr>
-        <w:t xml:space="preserve">eport is subject to the terms of </w:t>
-      </w:r>
-      <w:r>
-        <w:rPr>
-          <w:bCs/>
-          <w:kern w:val="0"/>
-        </w:rPr>
-        <w:t>proposal</w:t>
-      </w:r>
-      <w:r>
-        <w:rPr>
-          <w:rFonts w:hint="eastAsia"/>
-          <w:bCs/>
-          <w:kern w:val="0"/>
-        </w:rPr>
-        <w:t xml:space="preserve"> and the full settlement of the fees and all the expenses.</w:t>
-      </w:r>
-    </w:p>
-    <w:p>
-      <w:pPr>
-        <w:autoSpaceDE w:val="0"/>
-        <w:autoSpaceDN w:val="0"/>
-        <w:adjustRightInd w:val="0"/>
-        <w:snapToGrid w:val="0"/>
-        <w:spacing w:line="320" w:lineRule="exact"/>
-        <w:ind w:right="26"/>
-        <w:rPr>
-          <w:bCs/>
-          <w:kern w:val="0"/>
-        </w:rPr>
-      </w:pPr>
-    </w:p>
-    <w:p>
-      <w:pPr>
-        <w:autoSpaceDE w:val="0"/>
-        <w:autoSpaceDN w:val="0"/>
-        <w:adjustRightInd w:val="0"/>
-        <w:snapToGrid w:val="0"/>
-        <w:spacing w:line="320" w:lineRule="exact"/>
-        <w:ind w:right="26"/>
-        <w:rPr>
-          <w:bCs/>
-          <w:kern w:val="0"/>
-        </w:rPr>
-      </w:pPr>
-      <w:r>
-        <w:rPr>
-          <w:bCs/>
-          <w:kern w:val="0"/>
-        </w:rPr>
-        <w:t xml:space="preserve">We assume that there are no hidden or unexpected conditions associated with the subject matter under review that might adversely affect the reported result. Further, we assume no responsibility for changes in market conditions, government policy or other events after the Valuation Date. </w:t>
-      </w:r>
-      <w:r>
-        <w:rPr>
-          <w:bCs/>
-          <w:kern w:val="0"/>
-        </w:rPr>
-        <w:t>We cannot provide assurance on the achievability of the results estimated by the Client</w:t>
-      </w:r>
-      <w:r>
-        <w:rPr>
-          <w:bCs/>
-          <w:kern w:val="0"/>
-        </w:rPr>
-        <w:t xml:space="preserve">. </w:t>
-      </w:r>
-    </w:p>
-    <w:p>
-      <w:pPr>
-        <w:autoSpaceDE w:val="0"/>
-        <w:autoSpaceDN w:val="0"/>
-        <w:adjustRightInd w:val="0"/>
-        <w:snapToGrid w:val="0"/>
-        <w:spacing w:line="320" w:lineRule="exact"/>
-        <w:ind w:right="26"/>
-        <w:rPr>
-          <w:bCs/>
-          <w:kern w:val="0"/>
-        </w:rPr>
-      </w:pPr>
-    </w:p>
-    <w:p>
-      <w:pPr>
-        <w:autoSpaceDE w:val="0"/>
-        <w:autoSpaceDN w:val="0"/>
-        <w:adjustRightInd w:val="0"/>
-        <w:snapToGrid w:val="0"/>
-        <w:spacing w:line="320" w:lineRule="exact"/>
-        <w:ind w:right="26"/>
-        <w:rPr>
-          <w:bCs/>
-          <w:kern w:val="0"/>
-        </w:rPr>
-      </w:pPr>
-      <w:r>
-        <w:rPr>
-          <w:bCs/>
-          <w:kern w:val="0"/>
-        </w:rPr>
-        <w:t xml:space="preserve">We have not investigated the title to or any legal liabilities of the </w:t>
-      </w:r>
-      <w:r>
-        <w:rPr>
-          <w:bCs/>
-          <w:kern w:val="0"/>
-        </w:rPr>
-        <w:t>Options</w:t>
-      </w:r>
-      <w:r>
-        <w:rPr>
-          <w:bCs/>
-          <w:kern w:val="0"/>
-        </w:rPr>
-        <w:t xml:space="preserve"> and have assumed no responsibility for the title to the </w:t>
-      </w:r>
-      <w:r>
-        <w:rPr>
-          <w:bCs/>
-          <w:kern w:val="0"/>
-        </w:rPr>
-        <w:t>Options</w:t>
-      </w:r>
-      <w:r>
-        <w:rPr>
-          <w:bCs/>
-          <w:kern w:val="0"/>
-        </w:rPr>
-        <w:t>.</w:t>
-      </w:r>
-    </w:p>
-    <w:p>
-      <w:pPr>
-        <w:autoSpaceDE w:val="0"/>
-        <w:autoSpaceDN w:val="0"/>
-        <w:adjustRightInd w:val="0"/>
-        <w:snapToGrid w:val="0"/>
-        <w:spacing w:line="320" w:lineRule="exact"/>
-        <w:ind w:right="26"/>
-        <w:rPr>
-          <w:bCs/>
-          <w:kern w:val="0"/>
-        </w:rPr>
-      </w:pPr>
-    </w:p>
-    <w:p>
-      <w:pPr>
-        <w:autoSpaceDE w:val="0"/>
-        <w:autoSpaceDN w:val="0"/>
-        <w:adjustRightInd w:val="0"/>
-        <w:snapToGrid w:val="0"/>
-        <w:spacing w:line="320" w:lineRule="exact"/>
-        <w:ind w:right="26"/>
-        <w:rPr>
-          <w:bCs/>
-          <w:kern w:val="0"/>
-        </w:rPr>
-      </w:pPr>
-      <w:r>
-        <w:rPr>
-          <w:bCs/>
-          <w:kern w:val="0"/>
-        </w:rPr>
-        <w:t xml:space="preserve">In accordance with our standard practices, we must state that this report is for the exclusive use of the party to whom it is addressed and for the specific </w:t>
+        <w:t>represents the consideration based on information furn</w:t>
+      </w:r>
+      <w:r>
+        <w:rPr>
+          <w:bCs/>
+          <w:kern w:val="0"/>
+        </w:rPr>
+        <w:t xml:space="preserve">ished by the </w:t>
+      </w:r>
+      <w:r>
+        <w:rPr>
+          <w:bCs/>
+          <w:kern w:val="0"/>
+        </w:rPr>
+        <w:t>Client</w:t>
+      </w:r>
+      <w:r>
+        <w:rPr>
+          <w:bCs/>
+          <w:kern w:val="0"/>
+        </w:rPr>
+        <w:t xml:space="preserve"> and other sources. No responsibility is accepted to any third party for the whole or any part of its contents.</w:t>
+      </w:r>
+    </w:p>
+    <w:p>
+      <w:pPr>
+        <w:autoSpaceDE w:val="0"/>
+        <w:autoSpaceDN w:val="0"/>
+        <w:adjustRightInd w:val="0"/>
+        <w:snapToGrid w:val="0"/>
+        <w:spacing w:line="320" w:lineRule="exact"/>
+        <w:ind w:right="26"/>
+        <w:rPr>
+          <w:bCs/>
+          <w:kern w:val="0"/>
+        </w:rPr>
+      </w:pPr>
+    </w:p>
+    <w:p>
+      <w:pPr>
+        <w:autoSpaceDE w:val="0"/>
+        <w:autoSpaceDN w:val="0"/>
+        <w:adjustRightInd w:val="0"/>
+        <w:snapToGrid w:val="0"/>
+        <w:spacing w:line="320" w:lineRule="exact"/>
+        <w:ind w:right="26"/>
+        <w:rPr>
+          <w:bCs/>
+          <w:kern w:val="0"/>
+        </w:rPr>
+      </w:pPr>
+      <w:r>
+        <w:rPr>
+          <w:bCs/>
+          <w:kern w:val="0"/>
+        </w:rPr>
+        <w:lastRenderedPageBreak/>
+        <w:t xml:space="preserve">Save as and except for the </w:t>
       </w:r>
       <w:r>
         <w:rPr>
@@ -9732,106 +9352,7 @@
           <w:bCs/>
           <w:kern w:val="0"/>
         </w:rPr>
-        <w:t xml:space="preserve"> stated above. Furthermore, the report and conclusion of value are not intended by the author, and should not be construed by the reader, to be investment advice in any manner whatsoever. The conclusion of value</w:t>
-      </w:r>
-      <w:r>
-        <w:rPr>
-          <w:bCs/>
-          <w:kern w:val="0"/>
-        </w:rPr>
-        <w:t xml:space="preserve"> </w:t>
-      </w:r>
-      <w:r>
-        <w:rPr>
-          <w:bCs/>
-          <w:kern w:val="0"/>
-        </w:rPr>
-        <w:t>represents the consideration based on information furn</w:t>
-      </w:r>
-      <w:r>
-        <w:rPr>
-          <w:bCs/>
-          <w:kern w:val="0"/>
-        </w:rPr>
-        <w:t xml:space="preserve">ished by the </w:t>
-      </w:r>
-      <w:r>
-        <w:rPr>
-          <w:bCs/>
-          <w:kern w:val="0"/>
-        </w:rPr>
-        <w:t>Client</w:t>
-      </w:r>
-      <w:r>
-        <w:rPr>
-          <w:bCs/>
-          <w:kern w:val="0"/>
-        </w:rPr>
-        <w:t xml:space="preserve"> and other sources. No responsibility is accepted to any third party for the whole or any part of its contents.</w:t>
-      </w:r>
-    </w:p>
-    <w:p>
-      <w:pPr>
-        <w:autoSpaceDE w:val="0"/>
-        <w:autoSpaceDN w:val="0"/>
-        <w:adjustRightInd w:val="0"/>
-        <w:snapToGrid w:val="0"/>
-        <w:spacing w:line="320" w:lineRule="exact"/>
-        <w:ind w:right="26"/>
-        <w:rPr>
-          <w:bCs/>
-          <w:kern w:val="0"/>
-        </w:rPr>
-      </w:pPr>
-    </w:p>
-    <w:p>
-      <w:pPr>
-        <w:autoSpaceDE w:val="0"/>
-        <w:autoSpaceDN w:val="0"/>
-        <w:adjustRightInd w:val="0"/>
-        <w:snapToGrid w:val="0"/>
-        <w:spacing w:line="320" w:lineRule="exact"/>
-        <w:ind w:right="26"/>
-        <w:rPr>
-          <w:bCs/>
-          <w:kern w:val="0"/>
-        </w:rPr>
-      </w:pPr>
-      <w:r>
-        <w:rPr>
-          <w:bCs/>
-          <w:kern w:val="0"/>
-        </w:rPr>
-        <w:lastRenderedPageBreak/>
-        <w:t xml:space="preserve">Save as and except for </w:t>
-      </w:r>
-      <w:r>
-        <w:rPr>
-          <w:bCs/>
-          <w:kern w:val="0"/>
-        </w:rPr>
-        <w:t xml:space="preserve">the </w:t>
-      </w:r>
-      <w:r>
-        <w:rPr>
-          <w:bCs/>
-          <w:kern w:val="0"/>
-        </w:rPr>
-        <w:t>intended use</w:t>
-      </w:r>
-      <w:r>
-        <w:rPr>
-          <w:bCs/>
-          <w:kern w:val="0"/>
-        </w:rPr>
-        <w:t xml:space="preserve"> stated</w:t>
-      </w:r>
-      <w:r>
-        <w:rPr>
-          <w:bCs/>
-          <w:kern w:val="0"/>
-        </w:rPr>
-        <w:t xml:space="preserve"> above, neither the whole nor any part of this report nor any reference thereto may be included in any document, circular or statement without our written approval of the form and context in which it will appear.</w:t>
+        <w:t xml:space="preserve"> stated above, neither the whole nor any part of this report nor any reference thereto may be included in any document, circular or statement without our written approval of the form and context in which it will appear.</w:t>
       </w:r>
     </w:p>
     <w:p>
@@ -10160,29 +9681,14 @@
           <w:bCs/>
           <w:kern w:val="0"/>
         </w:rPr>
-        <w:t>valuation method and assumptions</w:t>
-      </w:r>
-      <w:r>
-        <w:rPr>
-          <w:bCs/>
-          <w:kern w:val="0"/>
-          <w:highlight w:val="cyan"/>
-        </w:rPr>
-        <w:t xml:space="preserve"> </w:t>
-      </w:r>
-      <w:r>
-        <w:rPr>
-          <w:bCs/>
-          <w:kern w:val="0"/>
-        </w:rPr>
-        <w:t>outlined in this report, we</w:t>
-      </w:r>
-      <w:r>
-        <w:rPr>
-          <w:bCs/>
-          <w:kern w:val="0"/>
-        </w:rPr>
-        <w:t xml:space="preserve"> are of the opinion that </w:t>
+        <w:t xml:space="preserve">valuation method and assumptions </w:t>
+      </w:r>
+      <w:r>
+        <w:rPr>
+          <w:bCs/>
+          <w:kern w:val="0"/>
+        </w:rPr>
+        <w:t xml:space="preserve">outlined in this report, we are of the opinion that </w:t>
       </w:r>
       <w:r>
         <w:rPr>
@@ -10253,7 +9759,6 @@
                 <w:kern w:val="0"/>
                 <w:sz w:val="20"/>
                 <w:szCs w:val="20"/>
-                <w:highlight w:val="green"/>
               </w:rPr>
             </w:pPr>
             <w:r>
@@ -10262,7 +9767,6 @@
                 <w:kern w:val="0"/>
                 <w:sz w:val="20"/>
                 <w:szCs w:val="20"/>
-                <w:highlight w:val="green"/>
               </w:rPr>
               <w:t>Valuation Date</w:t>
             </w:r>
@@ -10289,7 +9793,6 @@
                 <w:kern w:val="0"/>
                 <w:sz w:val="20"/>
                 <w:szCs w:val="20"/>
-                <w:highlight w:val="green"/>
               </w:rPr>
             </w:pPr>
             <w:r>
@@ -10298,7 +9801,6 @@
                 <w:kern w:val="0"/>
                 <w:sz w:val="20"/>
                 <w:szCs w:val="20"/>
-                <w:highlight w:val="green"/>
               </w:rPr>
               <w:t>Options Granted to</w:t>
             </w:r>
@@ -10325,7 +9827,6 @@
                 <w:kern w:val="0"/>
                 <w:sz w:val="20"/>
                 <w:szCs w:val="20"/>
-                <w:highlight w:val="green"/>
               </w:rPr>
             </w:pPr>
             <w:r>
@@ -10334,7 +9835,6 @@
                 <w:kern w:val="0"/>
                 <w:sz w:val="20"/>
                 <w:szCs w:val="20"/>
-                <w:highlight w:val="green"/>
               </w:rPr>
               <w:t>Per Option Value</w:t>
             </w:r>
@@ -10353,7 +9853,6 @@
                 <w:kern w:val="0"/>
                 <w:sz w:val="20"/>
                 <w:szCs w:val="20"/>
-                <w:highlight w:val="green"/>
               </w:rPr>
             </w:pPr>
             <w:r>
@@ -10362,7 +9861,6 @@
                 <w:kern w:val="0"/>
                 <w:sz w:val="20"/>
                 <w:szCs w:val="20"/>
-                <w:highlight w:val="green"/>
               </w:rPr>
               <w:t>(HKD)</w:t>
             </w:r>
@@ -10389,7 +9887,6 @@
                 <w:kern w:val="0"/>
                 <w:sz w:val="20"/>
                 <w:szCs w:val="20"/>
-                <w:highlight w:val="green"/>
               </w:rPr>
             </w:pPr>
             <w:r>
@@ -10398,7 +9895,6 @@
                 <w:kern w:val="0"/>
                 <w:sz w:val="20"/>
                 <w:szCs w:val="20"/>
-                <w:highlight w:val="green"/>
               </w:rPr>
               <w:t>Total Option Value</w:t>
             </w:r>
@@ -10417,7 +9913,6 @@
                 <w:kern w:val="0"/>
                 <w:sz w:val="20"/>
                 <w:szCs w:val="20"/>
-                <w:highlight w:val="green"/>
               </w:rPr>
             </w:pPr>
             <w:r>
@@ -10426,7 +9921,6 @@
                 <w:kern w:val="0"/>
                 <w:sz w:val="20"/>
                 <w:szCs w:val="20"/>
-                <w:highlight w:val="green"/>
               </w:rPr>
               <w:t>(HKD)</w:t>
             </w:r>
@@ -10455,14 +9949,12 @@
                 <w:kern w:val="0"/>
                 <w:sz w:val="20"/>
                 <w:szCs w:val="20"/>
-                <w:highlight w:val="green"/>
               </w:rPr>
             </w:pPr>
             <w:r>
               <w:rPr>
                 <w:sz w:val="20"/>
                 <w:szCs w:val="20"/>
-                <w:highlight w:val="green"/>
               </w:rPr>
               <w:t>{{</w:t>
             </w:r>
@@ -10471,7 +9963,6 @@
               <w:rPr>
                 <w:sz w:val="20"/>
                 <w:szCs w:val="20"/>
-                <w:highlight w:val="green"/>
               </w:rPr>
               <w:t>ValuationDate</w:t>
             </w:r>
@@ -10480,7 +9971,6 @@
               <w:rPr>
                 <w:sz w:val="20"/>
                 <w:szCs w:val="20"/>
-                <w:highlight w:val="green"/>
               </w:rPr>
               <w:t>}}</w:t>
             </w:r>
@@ -10507,14 +9997,12 @@
                 <w:kern w:val="0"/>
                 <w:sz w:val="20"/>
                 <w:szCs w:val="20"/>
-                <w:highlight w:val="green"/>
               </w:rPr>
             </w:pPr>
             <w:r>
               <w:rPr>
                 <w:sz w:val="20"/>
                 <w:szCs w:val="20"/>
-                <w:highlight w:val="green"/>
               </w:rPr>
               <w:t>Directors</w:t>
             </w:r>
@@ -10539,7 +10027,6 @@
               <w:rPr>
                 <w:sz w:val="20"/>
                 <w:szCs w:val="20"/>
-                <w:highlight w:val="green"/>
                 <w:lang w:val="en-US"/>
               </w:rPr>
             </w:pPr>
@@ -10547,7 +10034,6 @@
               <w:rPr>
                 <w:sz w:val="20"/>
                 <w:szCs w:val="20"/>
-                <w:highlight w:val="green"/>
               </w:rPr>
               <w:t>{{</w:t>
             </w:r>
@@ -10556,7 +10042,6 @@
               <w:rPr>
                 <w:sz w:val="20"/>
                 <w:szCs w:val="20"/>
-                <w:highlight w:val="green"/>
               </w:rPr>
               <w:t>PerOptionValue_Director</w:t>
             </w:r>
@@ -10565,7 +10050,6 @@
               <w:rPr>
                 <w:sz w:val="20"/>
                 <w:szCs w:val="20"/>
-                <w:highlight w:val="green"/>
               </w:rPr>
               <w:t>}}</w:t>
             </w:r>
@@ -10583,7 +10067,6 @@
                 <w:kern w:val="0"/>
                 <w:sz w:val="20"/>
                 <w:szCs w:val="20"/>
-                <w:highlight w:val="green"/>
               </w:rPr>
             </w:pPr>
           </w:p>
@@ -10607,7 +10090,6 @@
               <w:rPr>
                 <w:sz w:val="20"/>
                 <w:szCs w:val="20"/>
-                <w:highlight w:val="green"/>
                 <w:lang w:val="en-US"/>
               </w:rPr>
             </w:pPr>
@@ -10615,7 +10097,6 @@
               <w:rPr>
                 <w:sz w:val="20"/>
                 <w:szCs w:val="20"/>
-                <w:highlight w:val="green"/>
               </w:rPr>
               <w:t>{{</w:t>
             </w:r>
@@ -10624,7 +10105,6 @@
               <w:rPr>
                 <w:sz w:val="20"/>
                 <w:szCs w:val="20"/>
-                <w:highlight w:val="green"/>
                 <w:lang w:val="en-US"/>
               </w:rPr>
               <w:t>TotalOptionValueDirector</w:t>
@@ -10634,7 +10114,6 @@
               <w:rPr>
                 <w:sz w:val="20"/>
                 <w:szCs w:val="20"/>
-                <w:highlight w:val="green"/>
               </w:rPr>
               <w:t>}}</w:t>
             </w:r>
@@ -10660,14 +10139,12 @@
                 <w:kern w:val="0"/>
                 <w:sz w:val="20"/>
                 <w:szCs w:val="20"/>
-                <w:highlight w:val="green"/>
               </w:rPr>
             </w:pPr>
             <w:r>
               <w:rPr>
                 <w:sz w:val="20"/>
                 <w:szCs w:val="20"/>
-                <w:highlight w:val="green"/>
               </w:rPr>
               <w:t>{{</w:t>
             </w:r>
@@ -10676,7 +10153,6 @@
               <w:rPr>
                 <w:sz w:val="20"/>
                 <w:szCs w:val="20"/>
-                <w:highlight w:val="green"/>
               </w:rPr>
               <w:t>ValuationDate</w:t>
             </w:r>
@@ -10685,7 +10161,6 @@
               <w:rPr>
                 <w:sz w:val="20"/>
                 <w:szCs w:val="20"/>
-                <w:highlight w:val="green"/>
               </w:rPr>
               <w:t>}}</w:t>
             </w:r>
@@ -10709,14 +10184,12 @@
                 <w:kern w:val="0"/>
                 <w:sz w:val="20"/>
                 <w:szCs w:val="20"/>
-                <w:highlight w:val="green"/>
               </w:rPr>
             </w:pPr>
             <w:r>
               <w:rPr>
                 <w:sz w:val="20"/>
                 <w:szCs w:val="20"/>
-                <w:highlight w:val="green"/>
               </w:rPr>
               <w:t>Employee</w:t>
             </w:r>
@@ -10740,7 +10213,6 @@
                 <w:bCs/>
                 <w:sz w:val="20"/>
                 <w:szCs w:val="20"/>
-                <w:highlight w:val="green"/>
                 <w:lang w:val="en-US"/>
               </w:rPr>
             </w:pPr>
@@ -10748,7 +10220,6 @@
               <w:rPr>
                 <w:sz w:val="20"/>
                 <w:szCs w:val="20"/>
-                <w:highlight w:val="green"/>
               </w:rPr>
               <w:t>{{</w:t>
             </w:r>
@@ -10757,7 +10228,6 @@
               <w:rPr>
                 <w:sz w:val="20"/>
                 <w:szCs w:val="20"/>
-                <w:highlight w:val="green"/>
               </w:rPr>
               <w:t>PerOptionValue_Employee</w:t>
             </w:r>
@@ -10766,7 +10236,6 @@
               <w:rPr>
                 <w:sz w:val="20"/>
                 <w:szCs w:val="20"/>
-                <w:highlight w:val="green"/>
               </w:rPr>
               <w:t>}}</w:t>
             </w:r>
@@ -10785,7 +10254,6 @@
                 <w:kern w:val="0"/>
                 <w:sz w:val="20"/>
                 <w:szCs w:val="20"/>
-                <w:highlight w:val="green"/>
               </w:rPr>
             </w:pPr>
           </w:p>
@@ -10808,14 +10276,12 @@
                 <w:kern w:val="0"/>
                 <w:sz w:val="20"/>
                 <w:szCs w:val="20"/>
-                <w:highlight w:val="green"/>
               </w:rPr>
             </w:pPr>
             <w:r>
               <w:rPr>
                 <w:sz w:val="20"/>
                 <w:szCs w:val="20"/>
-                <w:highlight w:val="green"/>
               </w:rPr>
               <w:t>{{</w:t>
             </w:r>
@@ -10824,7 +10290,6 @@
               <w:rPr>
                 <w:sz w:val="20"/>
                 <w:szCs w:val="20"/>
-                <w:highlight w:val="green"/>
               </w:rPr>
               <w:t>TotalOptionValueEmployee</w:t>
             </w:r>
@@ -10833,7 +10298,6 @@
               <w:rPr>
                 <w:sz w:val="20"/>
                 <w:szCs w:val="20"/>
-                <w:highlight w:val="green"/>
               </w:rPr>
               <w:t>}}</w:t>
             </w:r>
@@ -10859,7 +10323,6 @@
                 <w:kern w:val="0"/>
                 <w:sz w:val="20"/>
                 <w:szCs w:val="20"/>
-                <w:highlight w:val="green"/>
               </w:rPr>
             </w:pPr>
             <w:r>
@@ -10868,7 +10331,6 @@
                 <w:kern w:val="0"/>
                 <w:sz w:val="20"/>
                 <w:szCs w:val="20"/>
-                <w:highlight w:val="green"/>
               </w:rPr>
               <w:t>Total</w:t>
             </w:r>
@@ -10892,7 +10354,6 @@
                 <w:kern w:val="0"/>
                 <w:sz w:val="20"/>
                 <w:szCs w:val="20"/>
-                <w:highlight w:val="green"/>
               </w:rPr>
             </w:pPr>
           </w:p>
@@ -10915,7 +10376,6 @@
                 <w:kern w:val="0"/>
                 <w:sz w:val="20"/>
                 <w:szCs w:val="20"/>
-                <w:highlight w:val="green"/>
               </w:rPr>
             </w:pPr>
           </w:p>
@@ -10938,7 +10398,6 @@
                 <w:kern w:val="0"/>
                 <w:sz w:val="20"/>
                 <w:szCs w:val="20"/>
-                <w:highlight w:val="green"/>
               </w:rPr>
             </w:pPr>
             <w:r>
@@ -10946,7 +10405,6 @@
                 <w:b/>
                 <w:sz w:val="20"/>
                 <w:szCs w:val="20"/>
-                <w:highlight w:val="green"/>
               </w:rPr>
               <w:t>{{</w:t>
             </w:r>
@@ -10956,7 +10414,6 @@
                 <w:b/>
                 <w:sz w:val="20"/>
                 <w:szCs w:val="20"/>
-                <w:highlight w:val="green"/>
               </w:rPr>
               <w:t>TotalOptionValue</w:t>
             </w:r>
@@ -10966,7 +10423,6 @@
                 <w:b/>
                 <w:sz w:val="20"/>
                 <w:szCs w:val="20"/>
-                <w:highlight w:val="green"/>
               </w:rPr>
               <w:t>}}</w:t>
             </w:r>
@@ -11511,7 +10967,6 @@
               <w:rPr>
                 <w:b/>
                 <w:iCs/>
-                <w:highlight w:val="yellow"/>
                 <w:lang w:eastAsia="zh-HK"/>
               </w:rPr>
             </w:pPr>
@@ -11519,7 +10974,6 @@
               <w:rPr>
                 <w:b/>
                 <w:iCs/>
-                <w:highlight w:val="yellow"/>
                 <w:lang w:eastAsia="zh-HK"/>
               </w:rPr>
               <w:t>[Henry H.W. Yung</w:t>
@@ -11534,7 +10988,6 @@
               <w:rPr>
                 <w:b/>
                 <w:iCs/>
-                <w:highlight w:val="yellow"/>
                 <w:lang w:eastAsia="zh-HK"/>
               </w:rPr>
             </w:pPr>
@@ -11542,7 +10995,6 @@
               <w:rPr>
                 <w:bCs/>
                 <w:iCs/>
-                <w:highlight w:val="yellow"/>
                 <w:lang w:eastAsia="zh-HK"/>
               </w:rPr>
               <w:t>Manager]</w:t>
@@ -11598,7 +11050,6 @@
               <w:rPr>
                 <w:b/>
                 <w:iCs/>
-                <w:highlight w:val="yellow"/>
                 <w:lang w:eastAsia="zh-HK"/>
               </w:rPr>
             </w:pPr>
@@ -11668,14 +11119,12 @@
                 <w:iCs/>
                 <w:kern w:val="0"/>
                 <w:sz w:val="20"/>
-                <w:highlight w:val="yellow"/>
               </w:rPr>
             </w:pPr>
             <w:r>
               <w:rPr>
                 <w:iCs/>
                 <w:kern w:val="0"/>
-                <w:highlight w:val="yellow"/>
               </w:rPr>
               <w:t>[</w:t>
             </w:r>
@@ -11685,7 +11134,6 @@
                 <w:bCs/>
                 <w:iCs/>
                 <w:kern w:val="0"/>
-                <w:highlight w:val="yellow"/>
               </w:rPr>
               <w:t>Marvin T.Y. Chan</w:t>
             </w:r>
@@ -11693,7 +11141,6 @@
               <w:rPr>
                 <w:bCs/>
                 <w:iCs/>
-                <w:highlight w:val="yellow"/>
                 <w:lang w:eastAsia="zh-HK"/>
               </w:rPr>
               <w:t>,</w:t>
@@ -11704,7 +11151,6 @@
                 <w:iCs/>
                 <w:sz w:val="20"/>
                 <w:szCs w:val="20"/>
-                <w:highlight w:val="yellow"/>
                 <w:lang w:eastAsia="zh-HK"/>
               </w:rPr>
               <w:t xml:space="preserve"> </w:t>
@@ -11716,7 +11162,6 @@
                 <w:kern w:val="0"/>
                 <w:sz w:val="20"/>
                 <w:szCs w:val="20"/>
-                <w:highlight w:val="yellow"/>
               </w:rPr>
               <w:t>CFA</w:t>
             </w:r>
@@ -11730,7 +11175,6 @@
               <w:rPr>
                 <w:b/>
                 <w:iCs/>
-                <w:highlight w:val="yellow"/>
                 <w:lang w:eastAsia="zh-HK"/>
               </w:rPr>
             </w:pPr>
@@ -11738,7 +11182,6 @@
               <w:rPr>
                 <w:bCs/>
                 <w:iCs/>
-                <w:highlight w:val="yellow"/>
                 <w:lang w:eastAsia="zh-HK"/>
               </w:rPr>
               <w:t>Assistant Manager</w:t>
@@ -11746,7 +11189,6 @@
             <w:r>
               <w:rPr>
                 <w:iCs/>
-                <w:highlight w:val="yellow"/>
                 <w:lang w:eastAsia="zh-HK"/>
               </w:rPr>
               <w:t>]</w:t>
@@ -11805,7 +11247,6 @@
               <w:jc w:val="left"/>
               <w:rPr>
                 <w:kern w:val="0"/>
-                <w:highlight w:val="yellow"/>
               </w:rPr>
             </w:pPr>
           </w:p>
@@ -11868,13 +11309,11 @@
               <w:jc w:val="left"/>
               <w:rPr>
                 <w:kern w:val="0"/>
-                <w:highlight w:val="yellow"/>
               </w:rPr>
             </w:pPr>
             <w:r>
               <w:rPr>
                 <w:kern w:val="0"/>
-                <w:highlight w:val="yellow"/>
               </w:rPr>
               <w:t>[</w:t>
             </w:r>
@@ -11884,7 +11323,6 @@
                 <w:b/>
                 <w:bCs/>
                 <w:kern w:val="0"/>
-                <w:highlight w:val="yellow"/>
               </w:rPr>
               <w:t>C</w:t>
             </w:r>
@@ -11893,7 +11331,6 @@
                 <w:b/>
                 <w:bCs/>
                 <w:kern w:val="0"/>
-                <w:highlight w:val="yellow"/>
               </w:rPr>
               <w:t>hristy Y.C. Szeto</w:t>
             </w:r>
@@ -11912,13 +11349,11 @@
               <w:jc w:val="left"/>
               <w:rPr>
                 <w:kern w:val="0"/>
-                <w:highlight w:val="yellow"/>
               </w:rPr>
             </w:pPr>
             <w:r>
               <w:rPr>
                 <w:kern w:val="0"/>
-                <w:highlight w:val="yellow"/>
               </w:rPr>
               <w:t xml:space="preserve">Senior </w:t>
             </w:r>
@@ -11926,14 +11361,12 @@
               <w:rPr>
                 <w:rFonts w:hint="eastAsia"/>
                 <w:kern w:val="0"/>
-                <w:highlight w:val="yellow"/>
               </w:rPr>
               <w:t>A</w:t>
             </w:r>
             <w:r>
               <w:rPr>
                 <w:kern w:val="0"/>
-                <w:highlight w:val="yellow"/>
               </w:rPr>
               <w:t>nalyst]</w:t>
             </w:r>
@@ -12179,19 +11612,7 @@
         <w:rPr>
           <w:lang w:eastAsia="zh-HK"/>
         </w:rPr>
-        <w:t xml:space="preserve">the </w:t>
-      </w:r>
-      <w:r>
-        <w:rPr>
-          <w:lang w:eastAsia="zh-HK"/>
-        </w:rPr>
-        <w:t xml:space="preserve">Royal Institution of Chartered Surveyors </w:t>
-      </w:r>
-      <w:r>
-        <w:rPr>
-          <w:lang w:eastAsia="zh-HK"/>
-        </w:rPr>
-        <w:t>(</w:t>
+        <w:t>the Royal Institution of Chartered Surveyors (</w:t>
       </w:r>
       <w:r>
         <w:rPr>

</xml_diff>

<commit_message>
add excel template, calc script. lack docx modificatioin
</commit_message>
<xml_diff>
--- a/.claude/skills/per-option-value/template/ESO_Report Template_v2.docx
+++ b/.claude/skills/per-option-value/template/ESO_Report Template_v2.docx
@@ -1934,23 +1934,7 @@
                 <w:b/>
                 <w:color w:val="262626"/>
               </w:rPr>
-              <w:t>{{</w:t>
-            </w:r>
-            <w:proofErr w:type="spellStart"/>
-            <w:r>
-              <w:rPr>
-                <w:b/>
-                <w:color w:val="262626"/>
-              </w:rPr>
-              <w:t>ReferenceNumber</w:t>
-            </w:r>
-            <w:proofErr w:type="spellEnd"/>
-            <w:r>
-              <w:rPr>
-                <w:b/>
-                <w:color w:val="262626"/>
-              </w:rPr>
-              <w:t>}}</w:t>
+              <w:t>{{ReferenceNumber}}</w:t>
             </w:r>
           </w:p>
         </w:tc>
@@ -5107,29 +5091,48 @@
       </w:pPr>
       <w:r>
         <w:rPr>
-          <w:bCs/>
-          <w:kern w:val="0"/>
+          <w:rFonts w:asciiTheme="minorEastAsia" w:eastAsiaTheme="minorEastAsia" w:hAnsiTheme="minorEastAsia" w:hint="eastAsia"/>
+          <w:bCs/>
+          <w:kern w:val="0"/>
+          <w:lang w:eastAsia="zh-CN"/>
         </w:rPr>
         <w:t>[</w:t>
       </w:r>
       <w:r>
         <w:rPr>
-          <w:bCs/>
-          <w:kern w:val="0"/>
-        </w:rPr>
-        <w:t xml:space="preserve">The Client </w:t>
-      </w:r>
-      <w:r>
-        <w:rPr>
-          <w:bCs/>
-          <w:kern w:val="0"/>
-        </w:rPr>
-        <w:t>is a London-based conglomerate established in 1990, operates across diverse sectors such as energy, finance, real estate, and technology. With a global presence spanning Europe, North America, Asia, and Africa, the company caters to a broad customer base with offerings in renewable energy, financial services, property development, and tech solutions.</w:t>
-      </w:r>
-      <w:r>
-        <w:rPr>
-          <w:bCs/>
-          <w:kern w:val="0"/>
+          <w:rFonts w:asciiTheme="minorEastAsia" w:eastAsiaTheme="minorEastAsia" w:hAnsiTheme="minorEastAsia" w:hint="eastAsia"/>
+          <w:bCs/>
+          <w:kern w:val="0"/>
+          <w:lang w:eastAsia="zh-CN"/>
+        </w:rPr>
+        <w:t>{{</w:t>
+      </w:r>
+      <w:proofErr w:type="spellStart"/>
+      <w:r>
+        <w:rPr>
+          <w:rFonts w:asciiTheme="minorEastAsia" w:eastAsiaTheme="minorEastAsia" w:hAnsiTheme="minorEastAsia" w:hint="eastAsia"/>
+          <w:bCs/>
+          <w:kern w:val="0"/>
+          <w:lang w:eastAsia="zh-CN"/>
+        </w:rPr>
+        <w:t>CompanyProfile</w:t>
+      </w:r>
+      <w:proofErr w:type="spellEnd"/>
+      <w:r>
+        <w:rPr>
+          <w:rFonts w:asciiTheme="minorEastAsia" w:eastAsiaTheme="minorEastAsia" w:hAnsiTheme="minorEastAsia" w:hint="eastAsia"/>
+          <w:bCs/>
+          <w:kern w:val="0"/>
+          <w:lang w:eastAsia="zh-CN"/>
+        </w:rPr>
+        <w:t>}}</w:t>
+      </w:r>
+      <w:r>
+        <w:rPr>
+          <w:rFonts w:asciiTheme="minorEastAsia" w:eastAsiaTheme="minorEastAsia" w:hAnsiTheme="minorEastAsia" w:hint="eastAsia"/>
+          <w:bCs/>
+          <w:kern w:val="0"/>
+          <w:lang w:eastAsia="zh-CN"/>
         </w:rPr>
         <w:t>]</w:t>
       </w:r>
@@ -5362,7 +5365,6 @@
       <w:bookmarkStart w:id="24" w:name="_Toc166511325"/>
       <w:bookmarkStart w:id="25" w:name="_Toc192264809"/>
       <w:r>
-        <w:lastRenderedPageBreak/>
         <w:t>BACKGROUND OF THE OPTIONS</w:t>
       </w:r>
       <w:bookmarkEnd w:id="24"/>
@@ -5400,6 +5402,7 @@
           <w:bCs/>
           <w:kern w:val="0"/>
         </w:rPr>
+        <w:lastRenderedPageBreak/>
         <w:t>[Pursuant to the announcement dated 13 May 2022 made by the Client, the Options were granted to eligible participants to subscribe for an aggregate of 23,000,000 ordinary shares of the Client.]</w:t>
       </w:r>
     </w:p>
@@ -12900,6 +12903,7 @@
               <w:szCs w:val="18"/>
             </w:rPr>
           </w:pPr>
+          <w:proofErr w:type="spellStart"/>
           <w:r>
             <w:rPr>
               <w:i/>
@@ -12907,7 +12911,17 @@
               <w:sz w:val="18"/>
               <w:szCs w:val="18"/>
             </w:rPr>
-            <w:t>Graval Consulting Limited</w:t>
+            <w:t>Graval</w:t>
+          </w:r>
+          <w:proofErr w:type="spellEnd"/>
+          <w:r>
+            <w:rPr>
+              <w:i/>
+              <w:iCs/>
+              <w:sz w:val="18"/>
+              <w:szCs w:val="18"/>
+            </w:rPr>
+            <w:t xml:space="preserve"> Consulting Limited</w:t>
           </w:r>
         </w:p>
         <w:p>
@@ -13616,6 +13630,7 @@
             </w:rPr>
             <w:t>{{</w:t>
           </w:r>
+          <w:proofErr w:type="spellStart"/>
           <w:r>
             <w:rPr>
               <w:i/>
@@ -13626,6 +13641,7 @@
             </w:rPr>
             <w:t>ClientName</w:t>
           </w:r>
+          <w:proofErr w:type="spellEnd"/>
           <w:r>
             <w:rPr>
               <w:i/>

</xml_diff>

<commit_message>
finished excel creation, need to modify docx and template
</commit_message>
<xml_diff>
--- a/.claude/skills/per-option-value/template/ESO_Report Template_v2.docx
+++ b/.claude/skills/per-option-value/template/ESO_Report Template_v2.docx
@@ -8169,7 +8169,28 @@
                 <w:sz w:val="20"/>
                 <w:szCs w:val="20"/>
               </w:rPr>
-              <w:t>{{TimeToVest}}</w:t>
+              <w:t>{{</w:t>
+            </w:r>
+            <w:proofErr w:type="spellStart"/>
+            <w:r>
+              <w:rPr>
+                <w:bCs/>
+                <w:kern w:val="0"/>
+                <w:sz w:val="20"/>
+                <w:szCs w:val="20"/>
+                <w:lang w:val="en-US"/>
+              </w:rPr>
+              <w:t>VestingDate</w:t>
+            </w:r>
+            <w:proofErr w:type="spellEnd"/>
+            <w:r>
+              <w:rPr>
+                <w:bCs/>
+                <w:kern w:val="0"/>
+                <w:sz w:val="20"/>
+                <w:szCs w:val="20"/>
+              </w:rPr>
+              <w:t>}}</w:t>
             </w:r>
           </w:p>
         </w:tc>
@@ -16112,7 +16133,6 @@
   <w:style w:type="character" w:default="1" w:styleId="DefaultParagraphFont">
     <w:name w:val="Default Paragraph Font"/>
     <w:uiPriority w:val="1"/>
-    <w:semiHidden/>
     <w:unhideWhenUsed/>
   </w:style>
   <w:style w:type="table" w:default="1" w:styleId="TableNormal">

</xml_diff>

<commit_message>
per-option docx templates modify
</commit_message>
<xml_diff>
--- a/.claude/skills/per-option-value/template/ESO_Report Template_v2.docx
+++ b/.claude/skills/per-option-value/template/ESO_Report Template_v2.docx
@@ -7060,7 +7060,7 @@
       </w:tblPr>
       <w:tblGrid>
         <w:gridCol w:w="1203"/>
-        <w:gridCol w:w="3035"/>
+        <w:gridCol w:w="3045"/>
         <w:gridCol w:w="2522"/>
         <w:gridCol w:w="2331"/>
       </w:tblGrid>
@@ -8552,6 +8552,7 @@
               </w:rPr>
               <w:t>{{</w:t>
             </w:r>
+            <w:proofErr w:type="spellStart"/>
             <w:r>
               <w:rPr>
                 <w:bCs/>
@@ -8560,28 +8561,7 @@
                 <w:szCs w:val="20"/>
                 <w:lang w:val="en-HK"/>
               </w:rPr>
-              <w:t>Post</w:t>
-            </w:r>
-            <w:r>
-              <w:rPr>
-                <w:bCs/>
-                <w:kern w:val="0"/>
-                <w:sz w:val="20"/>
-                <w:szCs w:val="20"/>
-                <w:lang w:val="en-HK"/>
-              </w:rPr>
-              <w:t>-</w:t>
-            </w:r>
-            <w:proofErr w:type="spellStart"/>
-            <w:r>
-              <w:rPr>
-                <w:bCs/>
-                <w:kern w:val="0"/>
-                <w:sz w:val="20"/>
-                <w:szCs w:val="20"/>
-                <w:lang w:val="en-HK"/>
-              </w:rPr>
-              <w:t>vestingExitRateEmployee</w:t>
+              <w:t>PostvestingExitRateEmployee</w:t>
             </w:r>
             <w:proofErr w:type="spellEnd"/>
             <w:r>
@@ -8605,7 +8585,6 @@
               <w:ind w:right="26" w:firstLine="0"/>
               <w:jc w:val="left"/>
               <w:rPr>
-                <w:rFonts w:hint="eastAsia"/>
                 <w:bCs/>
                 <w:kern w:val="0"/>
                 <w:sz w:val="20"/>
@@ -8623,6 +8602,7 @@
               </w:rPr>
               <w:t>{{</w:t>
             </w:r>
+            <w:proofErr w:type="spellStart"/>
             <w:r>
               <w:rPr>
                 <w:bCs/>
@@ -8631,18 +8611,7 @@
                 <w:szCs w:val="20"/>
                 <w:lang w:val="en-HK"/>
               </w:rPr>
-              <w:t>Post-</w:t>
-            </w:r>
-            <w:proofErr w:type="spellStart"/>
-            <w:r>
-              <w:rPr>
-                <w:bCs/>
-                <w:kern w:val="0"/>
-                <w:sz w:val="20"/>
-                <w:szCs w:val="20"/>
-                <w:lang w:val="en-HK"/>
-              </w:rPr>
-              <w:t>vestingExitRateEmployee</w:t>
+              <w:t>PostvestingExitRateEmployee</w:t>
             </w:r>
             <w:proofErr w:type="spellEnd"/>
             <w:r>
@@ -9480,6 +9449,7 @@
           <w:bCs/>
           <w:kern w:val="0"/>
         </w:rPr>
+        <w:lastRenderedPageBreak/>
         <w:t xml:space="preserve">Save as and except for the </w:t>
       </w:r>
       <w:r>

</xml_diff>